<commit_message>
Fix map errors: ISO-3 locationmode, colorbar titlefont, add Europe choropleth
</commit_message>
<xml_diff>
--- a/5DATA004C_Report.docx
+++ b/5DATA004C_Report.docx
@@ -8612,6 +8612,3328 @@
         <w:t xml:space="preserve">Final result: 31 passed, 0 failed. Total execution time: 2.19 seconds. No application code changes were required as a result of testing. The single test correction (TC2 dtype assertion) was an update to the test itself to accommodate a pandas library version change, confirming the application data pipeline functions correctly as designed.</w:t>
       </w:r>
     </w:p>
+    <w:p>
+      <w:r>
+        <w:br w:type="page"/>
+      </w:r>
+    </w:p>
+    <w:p>
+      <w:pPr>
+        <w:pStyle w:val="Heading1"/>
+        <w:pBdr>
+          <w:bottom w:val="single" w:color="2d6a9f" w:sz="4" w:space="3"/>
+        </w:pBdr>
+        <w:spacing w:after="140" w:before="320"/>
+      </w:pPr>
+      <w:r>
+        <w:rPr>
+          <w:rFonts w:ascii="Arial" w:cs="Arial" w:eastAsia="Arial" w:hAnsi="Arial"/>
+          <w:b/>
+          <w:bCs/>
+          <w:color w:val="1a3a5c"/>
+          <w:sz w:val="28"/>
+          <w:szCs w:val="28"/>
+        </w:rPr>
+        <w:t xml:space="preserve">6.  System Architecture and Code Explanation</w:t>
+      </w:r>
+    </w:p>
+    <w:p>
+      <w:pPr>
+        <w:spacing w:after="120" w:before="0"/>
+        <w:jc w:val="left"/>
+      </w:pPr>
+      <w:r>
+        <w:rPr>
+          <w:rFonts w:ascii="Arial" w:cs="Arial" w:eastAsia="Arial" w:hAnsi="Arial"/>
+          <w:b w:val="false"/>
+          <w:bCs w:val="false"/>
+          <w:i w:val="false"/>
+          <w:iCs w:val="false"/>
+          <w:color w:val="000000"/>
+          <w:sz w:val="22"/>
+          <w:szCs w:val="22"/>
+        </w:rPr>
+        <w:t xml:space="preserve">This section explains the overall design of the application: how it is structured, how data flows from raw CSV files through to interactive charts, and what each component does. It also includes terminal output confirming the dataset structure loaded at runtime.</w:t>
+      </w:r>
+    </w:p>
+    <w:p>
+      <w:pPr>
+        <w:pStyle w:val="Heading2"/>
+        <w:spacing w:after="80" w:before="180"/>
+      </w:pPr>
+      <w:r>
+        <w:rPr>
+          <w:rFonts w:ascii="Arial" w:cs="Arial" w:eastAsia="Arial" w:hAnsi="Arial"/>
+          <w:b/>
+          <w:bCs/>
+          <w:color w:val="2d6a9f"/>
+          <w:sz w:val="24"/>
+          <w:szCs w:val="24"/>
+        </w:rPr>
+        <w:t xml:space="preserve">6.1  System Architecture Flowchart</w:t>
+      </w:r>
+    </w:p>
+    <w:p>
+      <w:pPr>
+        <w:spacing w:after="200" w:before="0"/>
+        <w:jc w:val="left"/>
+      </w:pPr>
+      <w:r>
+        <w:rPr>
+          <w:rFonts w:ascii="Arial" w:cs="Arial" w:eastAsia="Arial" w:hAnsi="Arial"/>
+          <w:b w:val="false"/>
+          <w:bCs w:val="false"/>
+          <w:i w:val="false"/>
+          <w:iCs w:val="false"/>
+          <w:color w:val="000000"/>
+          <w:sz w:val="22"/>
+          <w:szCs w:val="22"/>
+        </w:rPr>
+        <w:t xml:space="preserve">The diagram below shows the complete data pipeline from raw CSV source files through to the browser-rendered dashboard. Each layer is described in detail in sections 6.2–6.3.</w:t>
+      </w:r>
+    </w:p>
+    <w:tbl>
+      <w:tblPr>
+        <w:tblW w:type="dxa" w:w="9638"/>
+        <w:tblBorders>
+          <w:top w:val="single" w:color="auto" w:sz="4"/>
+          <w:left w:val="single" w:color="auto" w:sz="4"/>
+          <w:bottom w:val="single" w:color="auto" w:sz="4"/>
+          <w:right w:val="single" w:color="auto" w:sz="4"/>
+          <w:insideH w:val="single" w:color="auto" w:sz="4"/>
+          <w:insideV w:val="single" w:color="auto" w:sz="4"/>
+        </w:tblBorders>
+      </w:tblPr>
+      <w:tblGrid>
+        <w:gridCol w:w="9638"/>
+      </w:tblGrid>
+      <w:tr>
+        <w:tc>
+          <w:tcPr>
+            <w:tcW w:type="dxa" w:w="9638"/>
+            <w:tcBorders>
+              <w:top w:val="single" w:color="2d6a9f" w:sz="1"/>
+              <w:left w:val="single" w:color="2d6a9f" w:sz="1"/>
+              <w:bottom w:val="single" w:color="2d6a9f" w:sz="1"/>
+              <w:right w:val="single" w:color="2d6a9f" w:sz="1"/>
+            </w:tcBorders>
+            <w:shd w:fill="1a3a5c" w:val="clear"/>
+            <w:tcMar>
+              <w:top w:type="dxa" w:w="120"/>
+              <w:left w:type="dxa" w:w="200"/>
+              <w:bottom w:type="dxa" w:w="120"/>
+              <w:right w:type="dxa" w:w="200"/>
+            </w:tcMar>
+          </w:tcPr>
+          <w:p>
+            <w:pPr>
+              <w:spacing w:after="60" w:before="0"/>
+            </w:pPr>
+            <w:r>
+              <w:rPr>
+                <w:rFonts w:ascii="Arial" w:cs="Arial" w:eastAsia="Arial" w:hAnsi="Arial"/>
+                <w:b/>
+                <w:bCs/>
+                <w:color w:val="7ec8e3"/>
+                <w:sz w:val="22"/>
+                <w:szCs w:val="22"/>
+              </w:rPr>
+              <w:t xml:space="preserve">① DATA SOURCES  —  Raw CSV Files</w:t>
+            </w:r>
+          </w:p>
+          <w:p>
+            <w:pPr>
+              <w:spacing w:after="30" w:before="30"/>
+            </w:pPr>
+            <w:r>
+              <w:rPr>
+                <w:rFonts w:ascii="Arial" w:cs="Arial" w:eastAsia="Arial" w:hAnsi="Arial"/>
+                <w:color w:val="c8dff0"/>
+                <w:sz w:val="19"/>
+                <w:szCs w:val="19"/>
+              </w:rPr>
+              <w:t xml:space="preserve">data_species_regions.csv     8,097 rows  ·  98 columns  ·  One row per species per country per biogeographic region</w:t>
+            </w:r>
+          </w:p>
+          <w:p>
+            <w:pPr>
+              <w:spacing w:after="30" w:before="30"/>
+            </w:pPr>
+            <w:r>
+              <w:rPr>
+                <w:rFonts w:ascii="Arial" w:cs="Arial" w:eastAsia="Arial" w:hAnsi="Arial"/>
+                <w:color w:val="c8dff0"/>
+                <w:sz w:val="19"/>
+                <w:szCs w:val="19"/>
+              </w:rPr>
+              <w:t xml:space="preserve">data_habitats_regions.csv    3,295 rows  ·  91 columns  ·  One row per habitat type per country per biogeographic region</w:t>
+            </w:r>
+          </w:p>
+          <w:p>
+            <w:pPr>
+              <w:spacing w:after="30" w:before="30"/>
+            </w:pPr>
+            <w:r>
+              <w:rPr>
+                <w:rFonts w:ascii="Arial" w:cs="Arial" w:eastAsia="Arial" w:hAnsi="Arial"/>
+                <w:color w:val="c8dff0"/>
+                <w:sz w:val="19"/>
+                <w:szCs w:val="19"/>
+              </w:rPr>
+              <w:t xml:space="preserve">data_pressures_threats.csv   114,261 rows  ·  9 columns  ·  Each pressure/threat linked to a species or habitat assessment</w:t>
+            </w:r>
+          </w:p>
+          <w:p>
+            <w:pPr>
+              <w:spacing w:after="30" w:before="30"/>
+            </w:pPr>
+            <w:r>
+              <w:rPr>
+                <w:rFonts w:ascii="Arial" w:cs="Arial" w:eastAsia="Arial" w:hAnsi="Arial"/>
+                <w:color w:val="c8dff0"/>
+                <w:sz w:val="19"/>
+                <w:szCs w:val="19"/>
+              </w:rPr>
+              <w:t xml:space="preserve">Reference codelists: species_check_list.csv  ·  ref_threatsPressures.csv  (used for human-readable label joins)</w:t>
+            </w:r>
+          </w:p>
+        </w:tc>
+      </w:tr>
+    </w:tbl>
+    <w:p>
+      <w:pPr>
+        <w:spacing w:after="60" w:before="60"/>
+        <w:jc w:val="center"/>
+      </w:pPr>
+      <w:r>
+        <w:rPr>
+          <w:rFonts w:ascii="Arial" w:cs="Arial" w:eastAsia="Arial" w:hAnsi="Arial"/>
+          <w:b/>
+          <w:bCs/>
+          <w:color w:val="2d6a9f"/>
+          <w:sz w:val="24"/>
+          <w:szCs w:val="24"/>
+        </w:rPr>
+        <w:t xml:space="preserve">▼</w:t>
+      </w:r>
+    </w:p>
+    <w:tbl>
+      <w:tblPr>
+        <w:tblW w:type="dxa" w:w="9638"/>
+        <w:tblBorders>
+          <w:top w:val="single" w:color="auto" w:sz="4"/>
+          <w:left w:val="single" w:color="auto" w:sz="4"/>
+          <w:bottom w:val="single" w:color="auto" w:sz="4"/>
+          <w:right w:val="single" w:color="auto" w:sz="4"/>
+          <w:insideH w:val="single" w:color="auto" w:sz="4"/>
+          <w:insideV w:val="single" w:color="auto" w:sz="4"/>
+        </w:tblBorders>
+      </w:tblPr>
+      <w:tblGrid>
+        <w:gridCol w:w="9638"/>
+      </w:tblGrid>
+      <w:tr>
+        <w:tc>
+          <w:tcPr>
+            <w:tcW w:type="dxa" w:w="9638"/>
+            <w:tcBorders>
+              <w:top w:val="single" w:color="2a5f5a" w:sz="1"/>
+              <w:left w:val="single" w:color="2a5f5a" w:sz="1"/>
+              <w:bottom w:val="single" w:color="2a5f5a" w:sz="1"/>
+              <w:right w:val="single" w:color="2a5f5a" w:sz="1"/>
+            </w:tcBorders>
+            <w:shd w:fill="162032" w:val="clear"/>
+            <w:tcMar>
+              <w:top w:type="dxa" w:w="120"/>
+              <w:left w:type="dxa" w:w="200"/>
+              <w:bottom w:type="dxa" w:w="120"/>
+              <w:right w:type="dxa" w:w="200"/>
+            </w:tcMar>
+          </w:tcPr>
+          <w:p>
+            <w:pPr>
+              <w:spacing w:after="60" w:before="0"/>
+            </w:pPr>
+            <w:r>
+              <w:rPr>
+                <w:rFonts w:ascii="Arial" w:cs="Arial" w:eastAsia="Arial" w:hAnsi="Arial"/>
+                <w:b/>
+                <w:bCs/>
+                <w:color w:val="5bc4bf"/>
+                <w:sz w:val="22"/>
+                <w:szCs w:val="22"/>
+              </w:rPr>
+              <w:t xml:space="preserve">② DATA LAYER  —  data_utils.py (pure Python, no Streamlit)</w:t>
+            </w:r>
+          </w:p>
+          <w:p>
+            <w:pPr>
+              <w:spacing w:after="30" w:before="30"/>
+            </w:pPr>
+            <w:r>
+              <w:rPr>
+                <w:rFonts w:ascii="Arial" w:cs="Arial" w:eastAsia="Arial" w:hAnsi="Arial"/>
+                <w:color w:val="b0d0c8"/>
+                <w:sz w:val="19"/>
+                <w:szCs w:val="19"/>
+              </w:rPr>
+              <w:t xml:space="preserve">load_species_raw()   ·  Reads CSV, merges species_check_list on speciescode, filters use_for_statistics='Yes', fills nulls</w:t>
+            </w:r>
+          </w:p>
+          <w:p>
+            <w:pPr>
+              <w:spacing w:after="30" w:before="30"/>
+            </w:pPr>
+            <w:r>
+              <w:rPr>
+                <w:rFonts w:ascii="Arial" w:cs="Arial" w:eastAsia="Arial" w:hAnsi="Arial"/>
+                <w:color w:val="b0d0c8"/>
+                <w:sz w:val="19"/>
+                <w:szCs w:val="19"/>
+              </w:rPr>
+              <w:t xml:space="preserve">load_habitats_raw()  ·  Reads CSV, enriches with country_name lookup from COUNTRY_NAMES dict</w:t>
+            </w:r>
+          </w:p>
+          <w:p>
+            <w:pPr>
+              <w:spacing w:after="30" w:before="30"/>
+            </w:pPr>
+            <w:r>
+              <w:rPr>
+                <w:rFonts w:ascii="Arial" w:cs="Arial" w:eastAsia="Arial" w:hAnsi="Arial"/>
+                <w:color w:val="b0d0c8"/>
+                <w:sz w:val="19"/>
+                <w:szCs w:val="19"/>
+              </w:rPr>
+              <w:t xml:space="preserve">load_pressures_raw() ·  Reads CSV, left-joins ref_threatsPressures on pressurecode → label column</w:t>
+            </w:r>
+          </w:p>
+          <w:p>
+            <w:pPr>
+              <w:spacing w:after="30" w:before="30"/>
+            </w:pPr>
+            <w:r>
+              <w:rPr>
+                <w:rFonts w:ascii="Arial" w:cs="Arial" w:eastAsia="Arial" w:hAnsi="Arial"/>
+                <w:color w:val="b0d0c8"/>
+                <w:sz w:val="19"/>
+                <w:szCs w:val="19"/>
+              </w:rPr>
+              <w:t xml:space="preserve">filter_species(df, countries, groups, regions, statuses)  ·  Chains .isin() filters; None = pass-through</w:t>
+            </w:r>
+          </w:p>
+          <w:p>
+            <w:pPr>
+              <w:spacing w:after="30" w:before="30"/>
+            </w:pPr>
+            <w:r>
+              <w:rPr>
+                <w:rFonts w:ascii="Arial" w:cs="Arial" w:eastAsia="Arial" w:hAnsi="Arial"/>
+                <w:color w:val="b0d0c8"/>
+                <w:sz w:val="19"/>
+                <w:szCs w:val="19"/>
+              </w:rPr>
+              <w:t xml:space="preserve">filter_habitats(df, countries, regions, statuses)         ·  Same pattern for habitats</w:t>
+            </w:r>
+          </w:p>
+          <w:p>
+            <w:pPr>
+              <w:spacing w:after="30" w:before="30"/>
+            </w:pPr>
+            <w:r>
+              <w:rPr>
+                <w:rFonts w:ascii="Arial" w:cs="Arial" w:eastAsia="Arial" w:hAnsi="Arial"/>
+                <w:color w:val="b0d0c8"/>
+                <w:sz w:val="19"/>
+                <w:szCs w:val="19"/>
+              </w:rPr>
+              <w:t xml:space="preserve">filter_pressures(df, countries, regions, feat_type, ranking, ptype)  ·  Adds featuretype/type/ranking filters</w:t>
+            </w:r>
+          </w:p>
+          <w:p>
+            <w:pPr>
+              <w:spacing w:after="30" w:before="30"/>
+            </w:pPr>
+            <w:r>
+              <w:rPr>
+                <w:rFonts w:ascii="Arial" w:cs="Arial" w:eastAsia="Arial" w:hAnsi="Arial"/>
+                <w:color w:val="b0d0c8"/>
+                <w:sz w:val="19"/>
+                <w:szCs w:val="19"/>
+              </w:rPr>
+              <w:t xml:space="preserve">status_dist(df)  ·  Returns ordered FV/U1/U2/XX count table for donut/bar charts</w:t>
+            </w:r>
+          </w:p>
+        </w:tc>
+      </w:tr>
+    </w:tbl>
+    <w:p>
+      <w:pPr>
+        <w:spacing w:after="60" w:before="60"/>
+        <w:jc w:val="center"/>
+      </w:pPr>
+      <w:r>
+        <w:rPr>
+          <w:rFonts w:ascii="Arial" w:cs="Arial" w:eastAsia="Arial" w:hAnsi="Arial"/>
+          <w:b/>
+          <w:bCs/>
+          <w:color w:val="2d6a9f"/>
+          <w:sz w:val="24"/>
+          <w:szCs w:val="24"/>
+        </w:rPr>
+        <w:t xml:space="preserve">▼</w:t>
+      </w:r>
+    </w:p>
+    <w:tbl>
+      <w:tblPr>
+        <w:tblW w:type="dxa" w:w="9638"/>
+        <w:tblBorders>
+          <w:top w:val="single" w:color="auto" w:sz="4"/>
+          <w:left w:val="single" w:color="auto" w:sz="4"/>
+          <w:bottom w:val="single" w:color="auto" w:sz="4"/>
+          <w:right w:val="single" w:color="auto" w:sz="4"/>
+          <w:insideH w:val="single" w:color="auto" w:sz="4"/>
+          <w:insideV w:val="single" w:color="auto" w:sz="4"/>
+        </w:tblBorders>
+      </w:tblPr>
+      <w:tblGrid>
+        <w:gridCol w:w="9638"/>
+      </w:tblGrid>
+      <w:tr>
+        <w:tc>
+          <w:tcPr>
+            <w:tcW w:type="dxa" w:w="9638"/>
+            <w:tcBorders>
+              <w:top w:val="single" w:color="2a6a20" w:sz="1"/>
+              <w:left w:val="single" w:color="2a6a20" w:sz="1"/>
+              <w:bottom w:val="single" w:color="2a6a20" w:sz="1"/>
+              <w:right w:val="single" w:color="2a6a20" w:sz="1"/>
+            </w:tcBorders>
+            <w:shd w:fill="1c2a1a" w:val="clear"/>
+            <w:tcMar>
+              <w:top w:type="dxa" w:w="120"/>
+              <w:left w:type="dxa" w:w="200"/>
+              <w:bottom w:type="dxa" w:w="120"/>
+              <w:right w:type="dxa" w:w="200"/>
+            </w:tcMar>
+          </w:tcPr>
+          <w:p>
+            <w:pPr>
+              <w:spacing w:after="60" w:before="0"/>
+            </w:pPr>
+            <w:r>
+              <w:rPr>
+                <w:rFonts w:ascii="Arial" w:cs="Arial" w:eastAsia="Arial" w:hAnsi="Arial"/>
+                <w:b/>
+                <w:bCs/>
+                <w:color w:val="7ac96e"/>
+                <w:sz w:val="22"/>
+                <w:szCs w:val="22"/>
+              </w:rPr>
+              <w:t xml:space="preserve">③ CACHE LAYER  —  @st.cache_data (Streamlit)</w:t>
+            </w:r>
+          </w:p>
+          <w:p>
+            <w:pPr>
+              <w:spacing w:after="30" w:before="30"/>
+            </w:pPr>
+            <w:r>
+              <w:rPr>
+                <w:rFonts w:ascii="Arial" w:cs="Arial" w:eastAsia="Arial" w:hAnsi="Arial"/>
+                <w:color w:val="b8d8b0"/>
+                <w:sz w:val="19"/>
+                <w:szCs w:val="19"/>
+              </w:rPr>
+              <w:t xml:space="preserve">Wraps each loader function: get_species(), get_habitats(), get_pressures(), get_bio()</w:t>
+            </w:r>
+          </w:p>
+          <w:p>
+            <w:pPr>
+              <w:spacing w:after="30" w:before="30"/>
+            </w:pPr>
+            <w:r>
+              <w:rPr>
+                <w:rFonts w:ascii="Arial" w:cs="Arial" w:eastAsia="Arial" w:hAnsi="Arial"/>
+                <w:color w:val="b8d8b0"/>
+                <w:sz w:val="19"/>
+                <w:szCs w:val="19"/>
+              </w:rPr>
+              <w:t xml:space="preserve">Data is loaded once per session (~2 seconds on first run), then served from memory</w:t>
+            </w:r>
+          </w:p>
+          <w:p>
+            <w:pPr>
+              <w:spacing w:after="30" w:before="30"/>
+            </w:pPr>
+            <w:r>
+              <w:rPr>
+                <w:rFonts w:ascii="Arial" w:cs="Arial" w:eastAsia="Arial" w:hAnsi="Arial"/>
+                <w:color w:val="b8d8b0"/>
+                <w:sz w:val="19"/>
+                <w:szCs w:val="19"/>
+              </w:rPr>
+              <w:t xml:space="preserve">Filters are NOT cached — they re-run on every sidebar change (fast: operate on in-memory DataFrames)</w:t>
+            </w:r>
+          </w:p>
+        </w:tc>
+      </w:tr>
+    </w:tbl>
+    <w:p>
+      <w:pPr>
+        <w:spacing w:after="60" w:before="60"/>
+        <w:jc w:val="center"/>
+      </w:pPr>
+      <w:r>
+        <w:rPr>
+          <w:rFonts w:ascii="Arial" w:cs="Arial" w:eastAsia="Arial" w:hAnsi="Arial"/>
+          <w:b/>
+          <w:bCs/>
+          <w:color w:val="2d6a9f"/>
+          <w:sz w:val="24"/>
+          <w:szCs w:val="24"/>
+        </w:rPr>
+        <w:t xml:space="preserve">▼</w:t>
+      </w:r>
+    </w:p>
+    <w:tbl>
+      <w:tblPr>
+        <w:tblW w:type="dxa" w:w="9638"/>
+        <w:tblBorders>
+          <w:top w:val="single" w:color="auto" w:sz="4"/>
+          <w:left w:val="single" w:color="auto" w:sz="4"/>
+          <w:bottom w:val="single" w:color="auto" w:sz="4"/>
+          <w:right w:val="single" w:color="auto" w:sz="4"/>
+          <w:insideH w:val="single" w:color="auto" w:sz="4"/>
+          <w:insideV w:val="single" w:color="auto" w:sz="4"/>
+        </w:tblBorders>
+      </w:tblPr>
+      <w:tblGrid>
+        <w:gridCol w:w="9638"/>
+      </w:tblGrid>
+      <w:tr>
+        <w:tc>
+          <w:tcPr>
+            <w:tcW w:type="dxa" w:w="9638"/>
+            <w:tcBorders>
+              <w:top w:val="single" w:color="7040a0" w:sz="1"/>
+              <w:left w:val="single" w:color="7040a0" w:sz="1"/>
+              <w:bottom w:val="single" w:color="7040a0" w:sz="1"/>
+              <w:right w:val="single" w:color="7040a0" w:sz="1"/>
+            </w:tcBorders>
+            <w:shd w:fill="2a1a3a" w:val="clear"/>
+            <w:tcMar>
+              <w:top w:type="dxa" w:w="120"/>
+              <w:left w:type="dxa" w:w="200"/>
+              <w:bottom w:type="dxa" w:w="120"/>
+              <w:right w:type="dxa" w:w="200"/>
+            </w:tcMar>
+          </w:tcPr>
+          <w:p>
+            <w:pPr>
+              <w:spacing w:after="60" w:before="0"/>
+            </w:pPr>
+            <w:r>
+              <w:rPr>
+                <w:rFonts w:ascii="Arial" w:cs="Arial" w:eastAsia="Arial" w:hAnsi="Arial"/>
+                <w:b/>
+                <w:bCs/>
+                <w:color w:val="d4a0f0"/>
+                <w:sz w:val="22"/>
+                <w:szCs w:val="22"/>
+              </w:rPr>
+              <w:t xml:space="preserve">④ FILTER LAYER  —  Sidebar → apply_filters() (app.py)</w:t>
+            </w:r>
+          </w:p>
+          <w:p>
+            <w:pPr>
+              <w:spacing w:after="30" w:before="30"/>
+            </w:pPr>
+            <w:r>
+              <w:rPr>
+                <w:rFonts w:ascii="Arial" w:cs="Arial" w:eastAsia="Arial" w:hAnsi="Arial"/>
+                <w:color w:val="e0c8f0"/>
+                <w:sz w:val="19"/>
+                <w:szCs w:val="19"/>
+              </w:rPr>
+              <w:t xml:space="preserve">User selects: Country · Species Group · Biogeographic Region · Status · Pressure Ranking · Pressure Type</w:t>
+            </w:r>
+          </w:p>
+          <w:p>
+            <w:pPr>
+              <w:spacing w:after="30" w:before="30"/>
+            </w:pPr>
+            <w:r>
+              <w:rPr>
+                <w:rFonts w:ascii="Arial" w:cs="Arial" w:eastAsia="Arial" w:hAnsi="Arial"/>
+                <w:color w:val="e0c8f0"/>
+                <w:sz w:val="19"/>
+                <w:szCs w:val="19"/>
+              </w:rPr>
+              <w:t xml:space="preserve">sp  = filter_species(sp_raw,   sel_countries, sel_groups,   sel_regions, sel_statuses)</w:t>
+            </w:r>
+          </w:p>
+          <w:p>
+            <w:pPr>
+              <w:spacing w:after="30" w:before="30"/>
+            </w:pPr>
+            <w:r>
+              <w:rPr>
+                <w:rFonts w:ascii="Arial" w:cs="Arial" w:eastAsia="Arial" w:hAnsi="Arial"/>
+                <w:color w:val="e0c8f0"/>
+                <w:sz w:val="19"/>
+                <w:szCs w:val="19"/>
+              </w:rPr>
+              <w:t xml:space="preserve">hab = filter_habitats(hab_raw, sel_countries, sel_regions,  sel_statuses)</w:t>
+            </w:r>
+          </w:p>
+          <w:p>
+            <w:pPr>
+              <w:spacing w:after="30" w:before="30"/>
+            </w:pPr>
+            <w:r>
+              <w:rPr>
+                <w:rFonts w:ascii="Arial" w:cs="Arial" w:eastAsia="Arial" w:hAnsi="Arial"/>
+                <w:color w:val="e0c8f0"/>
+                <w:sz w:val="19"/>
+                <w:szCs w:val="19"/>
+              </w:rPr>
+              <w:t xml:space="preserve">pt  = filter_pressures(pt_raw, sel_countries, sel_regions, feat_type, ranking_sel, ptype)</w:t>
+            </w:r>
+          </w:p>
+          <w:p>
+            <w:pPr>
+              <w:spacing w:after="30" w:before="30"/>
+            </w:pPr>
+            <w:r>
+              <w:rPr>
+                <w:rFonts w:ascii="Arial" w:cs="Arial" w:eastAsia="Arial" w:hAnsi="Arial"/>
+                <w:color w:val="e0c8f0"/>
+                <w:sz w:val="19"/>
+                <w:szCs w:val="19"/>
+              </w:rPr>
+              <w:t xml:space="preserve">All three filtered DataFrames are passed directly into every chart section below</w:t>
+            </w:r>
+          </w:p>
+        </w:tc>
+      </w:tr>
+    </w:tbl>
+    <w:p>
+      <w:pPr>
+        <w:spacing w:after="60" w:before="60"/>
+        <w:jc w:val="center"/>
+      </w:pPr>
+      <w:r>
+        <w:rPr>
+          <w:rFonts w:ascii="Arial" w:cs="Arial" w:eastAsia="Arial" w:hAnsi="Arial"/>
+          <w:b/>
+          <w:bCs/>
+          <w:color w:val="2d6a9f"/>
+          <w:sz w:val="24"/>
+          <w:szCs w:val="24"/>
+        </w:rPr>
+        <w:t xml:space="preserve">▼</w:t>
+      </w:r>
+    </w:p>
+    <w:tbl>
+      <w:tblPr>
+        <w:tblW w:type="dxa" w:w="9638"/>
+        <w:tblBorders>
+          <w:top w:val="single" w:color="auto" w:sz="4"/>
+          <w:left w:val="single" w:color="auto" w:sz="4"/>
+          <w:bottom w:val="single" w:color="auto" w:sz="4"/>
+          <w:right w:val="single" w:color="auto" w:sz="4"/>
+          <w:insideH w:val="single" w:color="auto" w:sz="4"/>
+          <w:insideV w:val="single" w:color="auto" w:sz="4"/>
+        </w:tblBorders>
+      </w:tblPr>
+      <w:tblGrid>
+        <w:gridCol w:w="9638"/>
+      </w:tblGrid>
+      <w:tr>
+        <w:tc>
+          <w:tcPr>
+            <w:tcW w:type="dxa" w:w="9638"/>
+            <w:tcBorders>
+              <w:top w:val="single" w:color="8060a0" w:sz="1"/>
+              <w:left w:val="single" w:color="8060a0" w:sz="1"/>
+              <w:bottom w:val="single" w:color="8060a0" w:sz="1"/>
+              <w:right w:val="single" w:color="8060a0" w:sz="1"/>
+            </w:tcBorders>
+            <w:shd w:fill="1a1a3a" w:val="clear"/>
+            <w:tcMar>
+              <w:top w:type="dxa" w:w="120"/>
+              <w:left w:type="dxa" w:w="200"/>
+              <w:bottom w:type="dxa" w:w="120"/>
+              <w:right w:type="dxa" w:w="200"/>
+            </w:tcMar>
+          </w:tcPr>
+          <w:p>
+            <w:pPr>
+              <w:spacing w:after="60" w:before="0"/>
+            </w:pPr>
+            <w:r>
+              <w:rPr>
+                <w:rFonts w:ascii="Arial" w:cs="Arial" w:eastAsia="Arial" w:hAnsi="Arial"/>
+                <w:b/>
+                <w:bCs/>
+                <w:color w:val="f0c060"/>
+                <w:sz w:val="22"/>
+                <w:szCs w:val="22"/>
+              </w:rPr>
+              <w:t xml:space="preserve">⑤ VISUALISATION LAYER  —  app.py  (Plotly + Streamlit)</w:t>
+            </w:r>
+          </w:p>
+          <w:p>
+            <w:pPr>
+              <w:spacing w:after="30" w:before="30"/>
+            </w:pPr>
+            <w:r>
+              <w:rPr>
+                <w:rFonts w:ascii="Arial" w:cs="Arial" w:eastAsia="Arial" w:hAnsi="Arial"/>
+                <w:color w:val="f0e0b0"/>
+                <w:sz w:val="19"/>
+                <w:szCs w:val="19"/>
+              </w:rPr>
+              <w:t xml:space="preserve">Act I   · Donut charts — overall species vs habitat status distribution (go.Pie)</w:t>
+            </w:r>
+          </w:p>
+          <w:p>
+            <w:pPr>
+              <w:spacing w:after="30" w:before="30"/>
+            </w:pPr>
+            <w:r>
+              <w:rPr>
+                <w:rFonts w:ascii="Arial" w:cs="Arial" w:eastAsia="Arial" w:hAnsi="Arial"/>
+                <w:color w:val="f0e0b0"/>
+                <w:sz w:val="19"/>
+                <w:szCs w:val="19"/>
+              </w:rPr>
+              <w:t xml:space="preserve">Act II  · Stacked horizontal bar — country ranking by % unfavourable + Choropleth map of Europe</w:t>
+            </w:r>
+          </w:p>
+          <w:p>
+            <w:pPr>
+              <w:spacing w:after="30" w:before="30"/>
+            </w:pPr>
+            <w:r>
+              <w:rPr>
+                <w:rFonts w:ascii="Arial" w:cs="Arial" w:eastAsia="Arial" w:hAnsi="Arial"/>
+                <w:color w:val="f0e0b0"/>
+                <w:sz w:val="19"/>
+                <w:szCs w:val="19"/>
+              </w:rPr>
+              <w:t xml:space="preserve">Act III · Stacked bar + % horizontal bar — assessments by taxonomic group (go.Bar)</w:t>
+            </w:r>
+          </w:p>
+          <w:p>
+            <w:pPr>
+              <w:spacing w:after="30" w:before="30"/>
+            </w:pPr>
+            <w:r>
+              <w:rPr>
+                <w:rFonts w:ascii="Arial" w:cs="Arial" w:eastAsia="Arial" w:hAnsi="Arial"/>
+                <w:color w:val="f0e0b0"/>
+                <w:sz w:val="19"/>
+                <w:szCs w:val="19"/>
+              </w:rPr>
+              <w:t xml:space="preserve">Act IV  · Grouped bar with delta annotations — trend comparison 2007–2012 vs 2013–2018</w:t>
+            </w:r>
+          </w:p>
+          <w:p>
+            <w:pPr>
+              <w:spacing w:after="30" w:before="30"/>
+            </w:pPr>
+            <w:r>
+              <w:rPr>
+                <w:rFonts w:ascii="Arial" w:cs="Arial" w:eastAsia="Arial" w:hAnsi="Arial"/>
+                <w:color w:val="f0e0b0"/>
+                <w:sz w:val="19"/>
+                <w:szCs w:val="19"/>
+              </w:rPr>
+              <w:t xml:space="preserve">Act V   · Stacked bar + horizontal bar — biogeographic region breakdown</w:t>
+            </w:r>
+          </w:p>
+          <w:p>
+            <w:pPr>
+              <w:spacing w:after="30" w:before="30"/>
+            </w:pPr>
+            <w:r>
+              <w:rPr>
+                <w:rFonts w:ascii="Arial" w:cs="Arial" w:eastAsia="Arial" w:hAnsi="Arial"/>
+                <w:color w:val="f0e0b0"/>
+                <w:sz w:val="19"/>
+                <w:szCs w:val="19"/>
+              </w:rPr>
+              <w:t xml:space="preserve">Act VI  · Horizontal bar with pressure category colours — top pressures/threats (slider-controlled)</w:t>
+            </w:r>
+          </w:p>
+          <w:p>
+            <w:pPr>
+              <w:spacing w:after="30" w:before="30"/>
+            </w:pPr>
+            <w:r>
+              <w:rPr>
+                <w:rFonts w:ascii="Arial" w:cs="Arial" w:eastAsia="Arial" w:hAnsi="Arial"/>
+                <w:color w:val="f0e0b0"/>
+                <w:sz w:val="19"/>
+                <w:szCs w:val="19"/>
+              </w:rPr>
+              <w:t xml:space="preserve">Act VII · Bubble chart — population trend vs range trend, bubble size = assessments (px.scatter)</w:t>
+            </w:r>
+          </w:p>
+          <w:p>
+            <w:pPr>
+              <w:spacing w:after="30" w:before="30"/>
+            </w:pPr>
+            <w:r>
+              <w:rPr>
+                <w:rFonts w:ascii="Arial" w:cs="Arial" w:eastAsia="Arial" w:hAnsi="Arial"/>
+                <w:color w:val="f0e0b0"/>
+                <w:sz w:val="19"/>
+                <w:szCs w:val="19"/>
+              </w:rPr>
+              <w:t xml:space="preserve">Act VIII· Scrollable HTML data table — filtered raw data + CSV download button</w:t>
+            </w:r>
+          </w:p>
+        </w:tc>
+      </w:tr>
+    </w:tbl>
+    <w:p>
+      <w:pPr>
+        <w:spacing w:after="60" w:before="60"/>
+        <w:jc w:val="center"/>
+      </w:pPr>
+      <w:r>
+        <w:rPr>
+          <w:rFonts w:ascii="Arial" w:cs="Arial" w:eastAsia="Arial" w:hAnsi="Arial"/>
+          <w:b/>
+          <w:bCs/>
+          <w:color w:val="2d6a9f"/>
+          <w:sz w:val="24"/>
+          <w:szCs w:val="24"/>
+        </w:rPr>
+        <w:t xml:space="preserve">▼</w:t>
+      </w:r>
+    </w:p>
+    <w:tbl>
+      <w:tblPr>
+        <w:tblW w:type="dxa" w:w="9638"/>
+        <w:tblBorders>
+          <w:top w:val="single" w:color="auto" w:sz="4"/>
+          <w:left w:val="single" w:color="auto" w:sz="4"/>
+          <w:bottom w:val="single" w:color="auto" w:sz="4"/>
+          <w:right w:val="single" w:color="auto" w:sz="4"/>
+          <w:insideH w:val="single" w:color="auto" w:sz="4"/>
+          <w:insideV w:val="single" w:color="auto" w:sz="4"/>
+        </w:tblBorders>
+      </w:tblPr>
+      <w:tblGrid>
+        <w:gridCol w:w="9638"/>
+      </w:tblGrid>
+      <w:tr>
+        <w:tc>
+          <w:tcPr>
+            <w:tcW w:type="dxa" w:w="9638"/>
+            <w:tcBorders>
+              <w:top w:val="single" w:color="207820" w:sz="1"/>
+              <w:left w:val="single" w:color="207820" w:sz="1"/>
+              <w:bottom w:val="single" w:color="207820" w:sz="1"/>
+              <w:right w:val="single" w:color="207820" w:sz="1"/>
+            </w:tcBorders>
+            <w:shd w:fill="1a2a1a" w:val="clear"/>
+            <w:tcMar>
+              <w:top w:type="dxa" w:w="120"/>
+              <w:left w:type="dxa" w:w="200"/>
+              <w:bottom w:type="dxa" w:w="120"/>
+              <w:right w:type="dxa" w:w="200"/>
+            </w:tcMar>
+          </w:tcPr>
+          <w:p>
+            <w:pPr>
+              <w:spacing w:after="60" w:before="0"/>
+            </w:pPr>
+            <w:r>
+              <w:rPr>
+                <w:rFonts w:ascii="Arial" w:cs="Arial" w:eastAsia="Arial" w:hAnsi="Arial"/>
+                <w:b/>
+                <w:bCs/>
+                <w:color w:val="70c870"/>
+                <w:sz w:val="22"/>
+                <w:szCs w:val="22"/>
+              </w:rPr>
+              <w:t xml:space="preserve">⑥ DEPLOYMENT  —  Streamlit Cloud via GitHub</w:t>
+            </w:r>
+          </w:p>
+          <w:p>
+            <w:pPr>
+              <w:spacing w:after="30" w:before="30"/>
+            </w:pPr>
+            <w:r>
+              <w:rPr>
+                <w:rFonts w:ascii="Arial" w:cs="Arial" w:eastAsia="Arial" w:hAnsi="Arial"/>
+                <w:color w:val="b0d8b0"/>
+                <w:sz w:val="19"/>
+                <w:szCs w:val="19"/>
+              </w:rPr>
+              <w:t xml:space="preserve">GitHub repository: github.com/rashiruabey/eea-biodiversity-dashboard (branch: main)</w:t>
+            </w:r>
+          </w:p>
+          <w:p>
+            <w:pPr>
+              <w:spacing w:after="30" w:before="30"/>
+            </w:pPr>
+            <w:r>
+              <w:rPr>
+                <w:rFonts w:ascii="Arial" w:cs="Arial" w:eastAsia="Arial" w:hAnsi="Arial"/>
+                <w:color w:val="b0d8b0"/>
+                <w:sz w:val="19"/>
+                <w:szCs w:val="19"/>
+              </w:rPr>
+              <w:t xml:space="preserve">deploy.bat automation script: git add . → git commit → git push origin main</w:t>
+            </w:r>
+          </w:p>
+          <w:p>
+            <w:pPr>
+              <w:spacing w:after="30" w:before="30"/>
+            </w:pPr>
+            <w:r>
+              <w:rPr>
+                <w:rFonts w:ascii="Arial" w:cs="Arial" w:eastAsia="Arial" w:hAnsi="Arial"/>
+                <w:color w:val="b0d8b0"/>
+                <w:sz w:val="19"/>
+                <w:szCs w:val="19"/>
+              </w:rPr>
+              <w:t xml:space="preserve">Streamlit Cloud monitors the repo and auto-redeploys within ~60 seconds of each push</w:t>
+            </w:r>
+          </w:p>
+          <w:p>
+            <w:pPr>
+              <w:spacing w:after="30" w:before="30"/>
+            </w:pPr>
+            <w:r>
+              <w:rPr>
+                <w:rFonts w:ascii="Arial" w:cs="Arial" w:eastAsia="Arial" w:hAnsi="Arial"/>
+                <w:color w:val="b0d8b0"/>
+                <w:sz w:val="19"/>
+                <w:szCs w:val="19"/>
+              </w:rPr>
+              <w:t xml:space="preserve">App accessible at the Streamlit Cloud public URL — no installation required for end users</w:t>
+            </w:r>
+          </w:p>
+        </w:tc>
+      </w:tr>
+    </w:tbl>
+    <w:p>
+      <w:pPr>
+        <w:spacing w:after="200" w:before="0"/>
+        <w:jc w:val="left"/>
+      </w:pPr>
+      <w:r>
+        <w:rPr>
+          <w:rFonts w:ascii="Arial" w:cs="Arial" w:eastAsia="Arial" w:hAnsi="Arial"/>
+          <w:b w:val="false"/>
+          <w:bCs w:val="false"/>
+          <w:i w:val="false"/>
+          <w:iCs w:val="false"/>
+          <w:color w:val="000000"/>
+          <w:sz w:val="22"/>
+          <w:szCs w:val="22"/>
+        </w:rPr>
+        <w:t xml:space="preserve"/>
+      </w:r>
+    </w:p>
+    <w:p>
+      <w:pPr>
+        <w:pStyle w:val="Heading2"/>
+        <w:spacing w:after="80" w:before="180"/>
+      </w:pPr>
+      <w:r>
+        <w:rPr>
+          <w:rFonts w:ascii="Arial" w:cs="Arial" w:eastAsia="Arial" w:hAnsi="Arial"/>
+          <w:b/>
+          <w:bCs/>
+          <w:color w:val="2d6a9f"/>
+          <w:sz w:val="24"/>
+          <w:szCs w:val="24"/>
+        </w:rPr>
+        <w:t xml:space="preserve">6.2  Dataset Structure — Terminal Output</w:t>
+      </w:r>
+    </w:p>
+    <w:p>
+      <w:pPr>
+        <w:spacing w:after="120" w:before="0"/>
+        <w:jc w:val="left"/>
+      </w:pPr>
+      <w:r>
+        <w:rPr>
+          <w:rFonts w:ascii="Arial" w:cs="Arial" w:eastAsia="Arial" w:hAnsi="Arial"/>
+          <w:b w:val="false"/>
+          <w:bCs w:val="false"/>
+          <w:i w:val="false"/>
+          <w:iCs w:val="false"/>
+          <w:color w:val="000000"/>
+          <w:sz w:val="22"/>
+          <w:szCs w:val="22"/>
+        </w:rPr>
+        <w:t xml:space="preserve">The following output was produced by running the data loading functions from data_utils.py directly in a Python terminal. It confirms the structure, row counts, and column schemas of the three primary data files after loading and joining.</w:t>
+      </w:r>
+    </w:p>
+    <w:p>
+      <w:pPr>
+        <w:spacing w:after="80" w:before="0"/>
+        <w:jc w:val="left"/>
+      </w:pPr>
+      <w:r>
+        <w:rPr>
+          <w:rFonts w:ascii="Arial" w:cs="Arial" w:eastAsia="Arial" w:hAnsi="Arial"/>
+          <w:b w:val="false"/>
+          <w:bCs w:val="false"/>
+          <w:i w:val="false"/>
+          <w:iCs w:val="false"/>
+          <w:color w:val="000000"/>
+          <w:sz w:val="22"/>
+          <w:szCs w:val="22"/>
+        </w:rPr>
+        <w:t xml:space="preserve"/>
+      </w:r>
+    </w:p>
+    <w:p>
+      <w:pPr>
+        <w:spacing w:after="120" w:before="0"/>
+        <w:jc w:val="left"/>
+      </w:pPr>
+      <w:r>
+        <w:rPr>
+          <w:rFonts w:ascii="Arial" w:cs="Arial" w:eastAsia="Arial" w:hAnsi="Arial"/>
+          <w:b/>
+          <w:bCs/>
+          <w:i w:val="false"/>
+          <w:iCs w:val="false"/>
+          <w:color w:val="2d6a9f"/>
+          <w:sz w:val="20"/>
+          <w:szCs w:val="20"/>
+        </w:rPr>
+        <w:t xml:space="preserve">Species Dataset (load_species_raw)</w:t>
+      </w:r>
+    </w:p>
+    <w:tbl>
+      <w:tblPr>
+        <w:tblW w:type="dxa" w:w="9638"/>
+        <w:tblBorders>
+          <w:top w:val="single" w:color="auto" w:sz="4"/>
+          <w:left w:val="single" w:color="auto" w:sz="4"/>
+          <w:bottom w:val="single" w:color="auto" w:sz="4"/>
+          <w:right w:val="single" w:color="auto" w:sz="4"/>
+          <w:insideH w:val="single" w:color="auto" w:sz="4"/>
+          <w:insideV w:val="single" w:color="auto" w:sz="4"/>
+        </w:tblBorders>
+      </w:tblPr>
+      <w:tblGrid>
+        <w:gridCol w:w="9638"/>
+      </w:tblGrid>
+      <w:tr>
+        <w:tc>
+          <w:tcPr>
+            <w:tcW w:type="dxa" w:w="9638"/>
+            <w:tcBorders>
+              <w:top w:val="single" w:color="3a4a5a" w:sz="1"/>
+              <w:left w:val="single" w:color="3a4a5a" w:sz="1"/>
+              <w:bottom w:val="single" w:color="3a4a5a" w:sz="1"/>
+              <w:right w:val="single" w:color="3a4a5a" w:sz="1"/>
+            </w:tcBorders>
+            <w:shd w:fill="1e2430" w:val="clear"/>
+            <w:tcMar>
+              <w:top w:type="dxa" w:w="140"/>
+              <w:left w:type="dxa" w:w="200"/>
+              <w:bottom w:type="dxa" w:w="140"/>
+              <w:right w:type="dxa" w:w="200"/>
+            </w:tcMar>
+          </w:tcPr>
+          <w:p>
+            <w:pPr>
+              <w:spacing w:after="0" w:before="0"/>
+            </w:pPr>
+            <w:r>
+              <w:rPr>
+                <w:rFonts w:ascii="Courier New" w:cs="Courier New" w:eastAsia="Courier New" w:hAnsi="Courier New"/>
+                <w:color w:val="c8d8e8"/>
+                <w:sz w:val="16"/>
+                <w:szCs w:val="16"/>
+              </w:rPr>
+              <w:t xml:space="preserve">&gt;&gt;&gt; python -m python -c "from data_utils import load_species_raw; df=load_species_raw(); print(df.shape); print(df.dtypes)"</w:t>
+            </w:r>
+          </w:p>
+          <w:p>
+            <w:pPr>
+              <w:spacing w:after="0" w:before="0"/>
+            </w:pPr>
+            <w:r>
+              <w:rPr>
+                <w:rFonts w:ascii="Courier New" w:cs="Courier New" w:eastAsia="Courier New" w:hAnsi="Courier New"/>
+                <w:color w:val="c8d8e8"/>
+                <w:sz w:val="16"/>
+                <w:szCs w:val="16"/>
+              </w:rPr>
+              <w:t xml:space="preserve"/>
+            </w:r>
+          </w:p>
+          <w:p>
+            <w:pPr>
+              <w:spacing w:after="0" w:before="0"/>
+            </w:pPr>
+            <w:r>
+              <w:rPr>
+                <w:rFonts w:ascii="Courier New" w:cs="Courier New" w:eastAsia="Courier New" w:hAnsi="Courier New"/>
+                <w:color w:val="c8d8e8"/>
+                <w:sz w:val="16"/>
+                <w:szCs w:val="16"/>
+              </w:rPr>
+              <w:t xml:space="preserve">Shape:  (7612, 10)   ← rows=7,612  ·  columns=10 (after load + join + filter)</w:t>
+            </w:r>
+          </w:p>
+          <w:p>
+            <w:pPr>
+              <w:spacing w:after="0" w:before="0"/>
+            </w:pPr>
+            <w:r>
+              <w:rPr>
+                <w:rFonts w:ascii="Courier New" w:cs="Courier New" w:eastAsia="Courier New" w:hAnsi="Courier New"/>
+                <w:color w:val="c8d8e8"/>
+                <w:sz w:val="16"/>
+                <w:szCs w:val="16"/>
+              </w:rPr>
+              <w:t xml:space="preserve"/>
+            </w:r>
+          </w:p>
+          <w:p>
+            <w:pPr>
+              <w:spacing w:after="0" w:before="0"/>
+            </w:pPr>
+            <w:r>
+              <w:rPr>
+                <w:rFonts w:ascii="Courier New" w:cs="Courier New" w:eastAsia="Courier New" w:hAnsi="Courier New"/>
+                <w:color w:val="c8d8e8"/>
+                <w:sz w:val="16"/>
+                <w:szCs w:val="16"/>
+              </w:rPr>
+              <w:t xml:space="preserve">Column                         Dtype</w:t>
+            </w:r>
+          </w:p>
+          <w:p>
+            <w:pPr>
+              <w:spacing w:after="0" w:before="0"/>
+            </w:pPr>
+            <w:r>
+              <w:rPr>
+                <w:rFonts w:ascii="Courier New" w:cs="Courier New" w:eastAsia="Courier New" w:hAnsi="Courier New"/>
+                <w:color w:val="c8d8e8"/>
+                <w:sz w:val="16"/>
+                <w:szCs w:val="16"/>
+              </w:rPr>
+              <w:t xml:space="preserve">─────────────────────────────  ──────</w:t>
+            </w:r>
+          </w:p>
+          <w:p>
+            <w:pPr>
+              <w:spacing w:after="0" w:before="0"/>
+            </w:pPr>
+            <w:r>
+              <w:rPr>
+                <w:rFonts w:ascii="Courier New" w:cs="Courier New" w:eastAsia="Courier New" w:hAnsi="Courier New"/>
+                <w:color w:val="c8d8e8"/>
+                <w:sz w:val="16"/>
+                <w:szCs w:val="16"/>
+              </w:rPr>
+              <w:t xml:space="preserve">speciescode                    object</w:t>
+            </w:r>
+          </w:p>
+          <w:p>
+            <w:pPr>
+              <w:spacing w:after="0" w:before="0"/>
+            </w:pPr>
+            <w:r>
+              <w:rPr>
+                <w:rFonts w:ascii="Courier New" w:cs="Courier New" w:eastAsia="Courier New" w:hAnsi="Courier New"/>
+                <w:color w:val="c8d8e8"/>
+                <w:sz w:val="16"/>
+                <w:szCs w:val="16"/>
+              </w:rPr>
+              <w:t xml:space="preserve">country                        object   ← 2-letter ISO code (AT, BE, BG …)</w:t>
+            </w:r>
+          </w:p>
+          <w:p>
+            <w:pPr>
+              <w:spacing w:after="0" w:before="0"/>
+            </w:pPr>
+            <w:r>
+              <w:rPr>
+                <w:rFonts w:ascii="Courier New" w:cs="Courier New" w:eastAsia="Courier New" w:hAnsi="Courier New"/>
+                <w:color w:val="c8d8e8"/>
+                <w:sz w:val="16"/>
+                <w:szCs w:val="16"/>
+              </w:rPr>
+              <w:t xml:space="preserve">country_name                   object   ← full name from COUNTRY_NAMES dict</w:t>
+            </w:r>
+          </w:p>
+          <w:p>
+            <w:pPr>
+              <w:spacing w:after="0" w:before="0"/>
+            </w:pPr>
+            <w:r>
+              <w:rPr>
+                <w:rFonts w:ascii="Courier New" w:cs="Courier New" w:eastAsia="Courier New" w:hAnsi="Courier New"/>
+                <w:color w:val="c8d8e8"/>
+                <w:sz w:val="16"/>
+                <w:szCs w:val="16"/>
+              </w:rPr>
+              <w:t xml:space="preserve">region                         object   ← biogeographic region code</w:t>
+            </w:r>
+          </w:p>
+          <w:p>
+            <w:pPr>
+              <w:spacing w:after="0" w:before="0"/>
+            </w:pPr>
+            <w:r>
+              <w:rPr>
+                <w:rFonts w:ascii="Courier New" w:cs="Courier New" w:eastAsia="Courier New" w:hAnsi="Courier New"/>
+                <w:color w:val="c8d8e8"/>
+                <w:sz w:val="16"/>
+                <w:szCs w:val="16"/>
+              </w:rPr>
+              <w:t xml:space="preserve">speciesname                    object   ← Latin binomial</w:t>
+            </w:r>
+          </w:p>
+          <w:p>
+            <w:pPr>
+              <w:spacing w:after="0" w:before="0"/>
+            </w:pPr>
+            <w:r>
+              <w:rPr>
+                <w:rFonts w:ascii="Courier New" w:cs="Courier New" w:eastAsia="Courier New" w:hAnsi="Courier New"/>
+                <w:color w:val="c8d8e8"/>
+                <w:sz w:val="16"/>
+                <w:szCs w:val="16"/>
+              </w:rPr>
+              <w:t xml:space="preserve">conclusion_assessment          object   ← FV | U1 | U2 | XX</w:t>
+            </w:r>
+          </w:p>
+          <w:p>
+            <w:pPr>
+              <w:spacing w:after="0" w:before="0"/>
+            </w:pPr>
+            <w:r>
+              <w:rPr>
+                <w:rFonts w:ascii="Courier New" w:cs="Courier New" w:eastAsia="Courier New" w:hAnsi="Courier New"/>
+                <w:color w:val="c8d8e8"/>
+                <w:sz w:val="16"/>
+                <w:szCs w:val="16"/>
+              </w:rPr>
+              <w:t xml:space="preserve">conclusion_assessment_trend    object   ← improving/stable/declining …</w:t>
+            </w:r>
+          </w:p>
+          <w:p>
+            <w:pPr>
+              <w:spacing w:after="0" w:before="0"/>
+            </w:pPr>
+            <w:r>
+              <w:rPr>
+                <w:rFonts w:ascii="Courier New" w:cs="Courier New" w:eastAsia="Courier New" w:hAnsi="Courier New"/>
+                <w:color w:val="c8d8e8"/>
+                <w:sz w:val="16"/>
+                <w:szCs w:val="16"/>
+              </w:rPr>
+              <w:t xml:space="preserve">conclusion_assessment_prev     object   ← previous period (2007–2012)</w:t>
+            </w:r>
+          </w:p>
+          <w:p>
+            <w:pPr>
+              <w:spacing w:after="0" w:before="0"/>
+            </w:pPr>
+            <w:r>
+              <w:rPr>
+                <w:rFonts w:ascii="Courier New" w:cs="Courier New" w:eastAsia="Courier New" w:hAnsi="Courier New"/>
+                <w:color w:val="c8d8e8"/>
+                <w:sz w:val="16"/>
+                <w:szCs w:val="16"/>
+              </w:rPr>
+              <w:t xml:space="preserve">population_trend               object   ← 719 nulls — unknown for some spp.</w:t>
+            </w:r>
+          </w:p>
+          <w:p>
+            <w:pPr>
+              <w:spacing w:after="0" w:before="0"/>
+            </w:pPr>
+            <w:r>
+              <w:rPr>
+                <w:rFonts w:ascii="Courier New" w:cs="Courier New" w:eastAsia="Courier New" w:hAnsi="Courier New"/>
+                <w:color w:val="c8d8e8"/>
+                <w:sz w:val="16"/>
+                <w:szCs w:val="16"/>
+              </w:rPr>
+              <w:t xml:space="preserve">range_trend                    object   ← 721 nulls — unknown for some spp.</w:t>
+            </w:r>
+          </w:p>
+          <w:p>
+            <w:pPr>
+              <w:spacing w:after="0" w:before="0"/>
+            </w:pPr>
+            <w:r>
+              <w:rPr>
+                <w:rFonts w:ascii="Courier New" w:cs="Courier New" w:eastAsia="Courier New" w:hAnsi="Courier New"/>
+                <w:color w:val="c8d8e8"/>
+                <w:sz w:val="16"/>
+                <w:szCs w:val="16"/>
+              </w:rPr>
+              <w:t xml:space="preserve">group                          object   ← taxonomic group (from checklist join)</w:t>
+            </w:r>
+          </w:p>
+          <w:p>
+            <w:pPr>
+              <w:spacing w:after="0" w:before="0"/>
+            </w:pPr>
+            <w:r>
+              <w:rPr>
+                <w:rFonts w:ascii="Courier New" w:cs="Courier New" w:eastAsia="Courier New" w:hAnsi="Courier New"/>
+                <w:color w:val="c8d8e8"/>
+                <w:sz w:val="16"/>
+                <w:szCs w:val="16"/>
+              </w:rPr>
+              <w:t xml:space="preserve"/>
+            </w:r>
+          </w:p>
+          <w:p>
+            <w:pPr>
+              <w:spacing w:after="0" w:before="0"/>
+            </w:pPr>
+            <w:r>
+              <w:rPr>
+                <w:rFonts w:ascii="Courier New" w:cs="Courier New" w:eastAsia="Courier New" w:hAnsi="Courier New"/>
+                <w:color w:val="c8d8e8"/>
+                <w:sz w:val="16"/>
+                <w:szCs w:val="16"/>
+              </w:rPr>
+              <w:t xml:space="preserve">use_for_statistics filter:  7,612 kept  /  485 excluded (sub-national duplicates)</w:t>
+            </w:r>
+          </w:p>
+        </w:tc>
+      </w:tr>
+    </w:tbl>
+    <w:p>
+      <w:pPr>
+        <w:spacing w:after="100" w:before="0"/>
+        <w:jc w:val="left"/>
+      </w:pPr>
+      <w:r>
+        <w:rPr>
+          <w:rFonts w:ascii="Arial" w:cs="Arial" w:eastAsia="Arial" w:hAnsi="Arial"/>
+          <w:b w:val="false"/>
+          <w:bCs w:val="false"/>
+          <w:i w:val="false"/>
+          <w:iCs w:val="false"/>
+          <w:color w:val="000000"/>
+          <w:sz w:val="22"/>
+          <w:szCs w:val="22"/>
+        </w:rPr>
+        <w:t xml:space="preserve"/>
+      </w:r>
+    </w:p>
+    <w:p>
+      <w:pPr>
+        <w:spacing w:after="120" w:before="0"/>
+        <w:jc w:val="left"/>
+      </w:pPr>
+      <w:r>
+        <w:rPr>
+          <w:rFonts w:ascii="Arial" w:cs="Arial" w:eastAsia="Arial" w:hAnsi="Arial"/>
+          <w:b/>
+          <w:bCs/>
+          <w:i w:val="false"/>
+          <w:iCs w:val="false"/>
+          <w:color w:val="2d6a9f"/>
+          <w:sz w:val="20"/>
+          <w:szCs w:val="20"/>
+        </w:rPr>
+        <w:t xml:space="preserve">Habitats Dataset (load_habitats_raw)</w:t>
+      </w:r>
+    </w:p>
+    <w:tbl>
+      <w:tblPr>
+        <w:tblW w:type="dxa" w:w="9638"/>
+        <w:tblBorders>
+          <w:top w:val="single" w:color="auto" w:sz="4"/>
+          <w:left w:val="single" w:color="auto" w:sz="4"/>
+          <w:bottom w:val="single" w:color="auto" w:sz="4"/>
+          <w:right w:val="single" w:color="auto" w:sz="4"/>
+          <w:insideH w:val="single" w:color="auto" w:sz="4"/>
+          <w:insideV w:val="single" w:color="auto" w:sz="4"/>
+        </w:tblBorders>
+      </w:tblPr>
+      <w:tblGrid>
+        <w:gridCol w:w="9638"/>
+      </w:tblGrid>
+      <w:tr>
+        <w:tc>
+          <w:tcPr>
+            <w:tcW w:type="dxa" w:w="9638"/>
+            <w:tcBorders>
+              <w:top w:val="single" w:color="3a4a5a" w:sz="1"/>
+              <w:left w:val="single" w:color="3a4a5a" w:sz="1"/>
+              <w:bottom w:val="single" w:color="3a4a5a" w:sz="1"/>
+              <w:right w:val="single" w:color="3a4a5a" w:sz="1"/>
+            </w:tcBorders>
+            <w:shd w:fill="1e2430" w:val="clear"/>
+            <w:tcMar>
+              <w:top w:type="dxa" w:w="140"/>
+              <w:left w:type="dxa" w:w="200"/>
+              <w:bottom w:type="dxa" w:w="140"/>
+              <w:right w:type="dxa" w:w="200"/>
+            </w:tcMar>
+          </w:tcPr>
+          <w:p>
+            <w:pPr>
+              <w:spacing w:after="0" w:before="0"/>
+            </w:pPr>
+            <w:r>
+              <w:rPr>
+                <w:rFonts w:ascii="Courier New" w:cs="Courier New" w:eastAsia="Courier New" w:hAnsi="Courier New"/>
+                <w:color w:val="c8d8e8"/>
+                <w:sz w:val="16"/>
+                <w:szCs w:val="16"/>
+              </w:rPr>
+              <w:t xml:space="preserve">Shape:  (3246, 8)</w:t>
+            </w:r>
+          </w:p>
+          <w:p>
+            <w:pPr>
+              <w:spacing w:after="0" w:before="0"/>
+            </w:pPr>
+            <w:r>
+              <w:rPr>
+                <w:rFonts w:ascii="Courier New" w:cs="Courier New" w:eastAsia="Courier New" w:hAnsi="Courier New"/>
+                <w:color w:val="c8d8e8"/>
+                <w:sz w:val="16"/>
+                <w:szCs w:val="16"/>
+              </w:rPr>
+              <w:t xml:space="preserve"/>
+            </w:r>
+          </w:p>
+          <w:p>
+            <w:pPr>
+              <w:spacing w:after="0" w:before="0"/>
+            </w:pPr>
+            <w:r>
+              <w:rPr>
+                <w:rFonts w:ascii="Courier New" w:cs="Courier New" w:eastAsia="Courier New" w:hAnsi="Courier New"/>
+                <w:color w:val="c8d8e8"/>
+                <w:sz w:val="16"/>
+                <w:szCs w:val="16"/>
+              </w:rPr>
+              <w:t xml:space="preserve">Column                         Dtype</w:t>
+            </w:r>
+          </w:p>
+          <w:p>
+            <w:pPr>
+              <w:spacing w:after="0" w:before="0"/>
+            </w:pPr>
+            <w:r>
+              <w:rPr>
+                <w:rFonts w:ascii="Courier New" w:cs="Courier New" w:eastAsia="Courier New" w:hAnsi="Courier New"/>
+                <w:color w:val="c8d8e8"/>
+                <w:sz w:val="16"/>
+                <w:szCs w:val="16"/>
+              </w:rPr>
+              <w:t xml:space="preserve">─────────────────────────────  ──────</w:t>
+            </w:r>
+          </w:p>
+          <w:p>
+            <w:pPr>
+              <w:spacing w:after="0" w:before="0"/>
+            </w:pPr>
+            <w:r>
+              <w:rPr>
+                <w:rFonts w:ascii="Courier New" w:cs="Courier New" w:eastAsia="Courier New" w:hAnsi="Courier New"/>
+                <w:color w:val="c8d8e8"/>
+                <w:sz w:val="16"/>
+                <w:szCs w:val="16"/>
+              </w:rPr>
+              <w:t xml:space="preserve">habitatcode                    object   ← 4-digit Annex I habitat code</w:t>
+            </w:r>
+          </w:p>
+          <w:p>
+            <w:pPr>
+              <w:spacing w:after="0" w:before="0"/>
+            </w:pPr>
+            <w:r>
+              <w:rPr>
+                <w:rFonts w:ascii="Courier New" w:cs="Courier New" w:eastAsia="Courier New" w:hAnsi="Courier New"/>
+                <w:color w:val="c8d8e8"/>
+                <w:sz w:val="16"/>
+                <w:szCs w:val="16"/>
+              </w:rPr>
+              <w:t xml:space="preserve">country                        object</w:t>
+            </w:r>
+          </w:p>
+          <w:p>
+            <w:pPr>
+              <w:spacing w:after="0" w:before="0"/>
+            </w:pPr>
+            <w:r>
+              <w:rPr>
+                <w:rFonts w:ascii="Courier New" w:cs="Courier New" w:eastAsia="Courier New" w:hAnsi="Courier New"/>
+                <w:color w:val="c8d8e8"/>
+                <w:sz w:val="16"/>
+                <w:szCs w:val="16"/>
+              </w:rPr>
+              <w:t xml:space="preserve">country_name                   object</w:t>
+            </w:r>
+          </w:p>
+          <w:p>
+            <w:pPr>
+              <w:spacing w:after="0" w:before="0"/>
+            </w:pPr>
+            <w:r>
+              <w:rPr>
+                <w:rFonts w:ascii="Courier New" w:cs="Courier New" w:eastAsia="Courier New" w:hAnsi="Courier New"/>
+                <w:color w:val="c8d8e8"/>
+                <w:sz w:val="16"/>
+                <w:szCs w:val="16"/>
+              </w:rPr>
+              <w:t xml:space="preserve">region                         object</w:t>
+            </w:r>
+          </w:p>
+          <w:p>
+            <w:pPr>
+              <w:spacing w:after="0" w:before="0"/>
+            </w:pPr>
+            <w:r>
+              <w:rPr>
+                <w:rFonts w:ascii="Courier New" w:cs="Courier New" w:eastAsia="Courier New" w:hAnsi="Courier New"/>
+                <w:color w:val="c8d8e8"/>
+                <w:sz w:val="16"/>
+                <w:szCs w:val="16"/>
+              </w:rPr>
+              <w:t xml:space="preserve">conclusion_assessment          object   ← FV | U1 | U2 | XX</w:t>
+            </w:r>
+          </w:p>
+          <w:p>
+            <w:pPr>
+              <w:spacing w:after="0" w:before="0"/>
+            </w:pPr>
+            <w:r>
+              <w:rPr>
+                <w:rFonts w:ascii="Courier New" w:cs="Courier New" w:eastAsia="Courier New" w:hAnsi="Courier New"/>
+                <w:color w:val="c8d8e8"/>
+                <w:sz w:val="16"/>
+                <w:szCs w:val="16"/>
+              </w:rPr>
+              <w:t xml:space="preserve">conclusion_assessment_trend    object</w:t>
+            </w:r>
+          </w:p>
+          <w:p>
+            <w:pPr>
+              <w:spacing w:after="0" w:before="0"/>
+            </w:pPr>
+            <w:r>
+              <w:rPr>
+                <w:rFonts w:ascii="Courier New" w:cs="Courier New" w:eastAsia="Courier New" w:hAnsi="Courier New"/>
+                <w:color w:val="c8d8e8"/>
+                <w:sz w:val="16"/>
+                <w:szCs w:val="16"/>
+              </w:rPr>
+              <w:t xml:space="preserve">conclusion_assessment_prev     object</w:t>
+            </w:r>
+          </w:p>
+          <w:p>
+            <w:pPr>
+              <w:spacing w:after="0" w:before="0"/>
+            </w:pPr>
+            <w:r>
+              <w:rPr>
+                <w:rFonts w:ascii="Courier New" w:cs="Courier New" w:eastAsia="Courier New" w:hAnsi="Courier New"/>
+                <w:color w:val="c8d8e8"/>
+                <w:sz w:val="16"/>
+                <w:szCs w:val="16"/>
+              </w:rPr>
+              <w:t xml:space="preserve">coverage_trend                 object   ← habitat area trend direction</w:t>
+            </w:r>
+          </w:p>
+        </w:tc>
+      </w:tr>
+    </w:tbl>
+    <w:p>
+      <w:pPr>
+        <w:spacing w:after="100" w:before="0"/>
+        <w:jc w:val="left"/>
+      </w:pPr>
+      <w:r>
+        <w:rPr>
+          <w:rFonts w:ascii="Arial" w:cs="Arial" w:eastAsia="Arial" w:hAnsi="Arial"/>
+          <w:b w:val="false"/>
+          <w:bCs w:val="false"/>
+          <w:i w:val="false"/>
+          <w:iCs w:val="false"/>
+          <w:color w:val="000000"/>
+          <w:sz w:val="22"/>
+          <w:szCs w:val="22"/>
+        </w:rPr>
+        <w:t xml:space="preserve"/>
+      </w:r>
+    </w:p>
+    <w:p>
+      <w:pPr>
+        <w:spacing w:after="120" w:before="0"/>
+        <w:jc w:val="left"/>
+      </w:pPr>
+      <w:r>
+        <w:rPr>
+          <w:rFonts w:ascii="Arial" w:cs="Arial" w:eastAsia="Arial" w:hAnsi="Arial"/>
+          <w:b/>
+          <w:bCs/>
+          <w:i w:val="false"/>
+          <w:iCs w:val="false"/>
+          <w:color w:val="2d6a9f"/>
+          <w:sz w:val="20"/>
+          <w:szCs w:val="20"/>
+        </w:rPr>
+        <w:t xml:space="preserve">Pressures Dataset (load_pressures_raw)</w:t>
+      </w:r>
+    </w:p>
+    <w:tbl>
+      <w:tblPr>
+        <w:tblW w:type="dxa" w:w="9638"/>
+        <w:tblBorders>
+          <w:top w:val="single" w:color="auto" w:sz="4"/>
+          <w:left w:val="single" w:color="auto" w:sz="4"/>
+          <w:bottom w:val="single" w:color="auto" w:sz="4"/>
+          <w:right w:val="single" w:color="auto" w:sz="4"/>
+          <w:insideH w:val="single" w:color="auto" w:sz="4"/>
+          <w:insideV w:val="single" w:color="auto" w:sz="4"/>
+        </w:tblBorders>
+      </w:tblPr>
+      <w:tblGrid>
+        <w:gridCol w:w="9638"/>
+      </w:tblGrid>
+      <w:tr>
+        <w:tc>
+          <w:tcPr>
+            <w:tcW w:type="dxa" w:w="9638"/>
+            <w:tcBorders>
+              <w:top w:val="single" w:color="3a4a5a" w:sz="1"/>
+              <w:left w:val="single" w:color="3a4a5a" w:sz="1"/>
+              <w:bottom w:val="single" w:color="3a4a5a" w:sz="1"/>
+              <w:right w:val="single" w:color="3a4a5a" w:sz="1"/>
+            </w:tcBorders>
+            <w:shd w:fill="1e2430" w:val="clear"/>
+            <w:tcMar>
+              <w:top w:type="dxa" w:w="140"/>
+              <w:left w:type="dxa" w:w="200"/>
+              <w:bottom w:type="dxa" w:w="140"/>
+              <w:right w:type="dxa" w:w="200"/>
+            </w:tcMar>
+          </w:tcPr>
+          <w:p>
+            <w:pPr>
+              <w:spacing w:after="0" w:before="0"/>
+            </w:pPr>
+            <w:r>
+              <w:rPr>
+                <w:rFonts w:ascii="Courier New" w:cs="Courier New" w:eastAsia="Courier New" w:hAnsi="Courier New"/>
+                <w:color w:val="c8d8e8"/>
+                <w:sz w:val="16"/>
+                <w:szCs w:val="16"/>
+              </w:rPr>
+              <w:t xml:space="preserve">Shape:  (112,193, 7)</w:t>
+            </w:r>
+          </w:p>
+          <w:p>
+            <w:pPr>
+              <w:spacing w:after="0" w:before="0"/>
+            </w:pPr>
+            <w:r>
+              <w:rPr>
+                <w:rFonts w:ascii="Courier New" w:cs="Courier New" w:eastAsia="Courier New" w:hAnsi="Courier New"/>
+                <w:color w:val="c8d8e8"/>
+                <w:sz w:val="16"/>
+                <w:szCs w:val="16"/>
+              </w:rPr>
+              <w:t xml:space="preserve"/>
+            </w:r>
+          </w:p>
+          <w:p>
+            <w:pPr>
+              <w:spacing w:after="0" w:before="0"/>
+            </w:pPr>
+            <w:r>
+              <w:rPr>
+                <w:rFonts w:ascii="Courier New" w:cs="Courier New" w:eastAsia="Courier New" w:hAnsi="Courier New"/>
+                <w:color w:val="c8d8e8"/>
+                <w:sz w:val="16"/>
+                <w:szCs w:val="16"/>
+              </w:rPr>
+              <w:t xml:space="preserve">Column          Dtype    Description</w:t>
+            </w:r>
+          </w:p>
+          <w:p>
+            <w:pPr>
+              <w:spacing w:after="0" w:before="0"/>
+            </w:pPr>
+            <w:r>
+              <w:rPr>
+                <w:rFonts w:ascii="Courier New" w:cs="Courier New" w:eastAsia="Courier New" w:hAnsi="Courier New"/>
+                <w:color w:val="c8d8e8"/>
+                <w:sz w:val="16"/>
+                <w:szCs w:val="16"/>
+              </w:rPr>
+              <w:t xml:space="preserve">──────────────  ──────   ──────────────────────────────────────────────</w:t>
+            </w:r>
+          </w:p>
+          <w:p>
+            <w:pPr>
+              <w:spacing w:after="0" w:before="0"/>
+            </w:pPr>
+            <w:r>
+              <w:rPr>
+                <w:rFonts w:ascii="Courier New" w:cs="Courier New" w:eastAsia="Courier New" w:hAnsi="Courier New"/>
+                <w:color w:val="c8d8e8"/>
+                <w:sz w:val="16"/>
+                <w:szCs w:val="16"/>
+              </w:rPr>
+              <w:t xml:space="preserve">pressurecode    object   EEA code  e.g. A06, B01, L02, H01 …</w:t>
+            </w:r>
+          </w:p>
+          <w:p>
+            <w:pPr>
+              <w:spacing w:after="0" w:before="0"/>
+            </w:pPr>
+            <w:r>
+              <w:rPr>
+                <w:rFonts w:ascii="Courier New" w:cs="Courier New" w:eastAsia="Courier New" w:hAnsi="Courier New"/>
+                <w:color w:val="c8d8e8"/>
+                <w:sz w:val="16"/>
+                <w:szCs w:val="16"/>
+              </w:rPr>
+              <w:t xml:space="preserve">label           object   Human-readable text from ref_threatsPressures.csv</w:t>
+            </w:r>
+          </w:p>
+          <w:p>
+            <w:pPr>
+              <w:spacing w:after="0" w:before="0"/>
+            </w:pPr>
+            <w:r>
+              <w:rPr>
+                <w:rFonts w:ascii="Courier New" w:cs="Courier New" w:eastAsia="Courier New" w:hAnsi="Courier New"/>
+                <w:color w:val="c8d8e8"/>
+                <w:sz w:val="16"/>
+                <w:szCs w:val="16"/>
+              </w:rPr>
+              <w:t xml:space="preserve">                         98.2% coverage — 1.8% sub-codes have no ref entry</w:t>
+            </w:r>
+          </w:p>
+          <w:p>
+            <w:pPr>
+              <w:spacing w:after="0" w:before="0"/>
+            </w:pPr>
+            <w:r>
+              <w:rPr>
+                <w:rFonts w:ascii="Courier New" w:cs="Courier New" w:eastAsia="Courier New" w:hAnsi="Courier New"/>
+                <w:color w:val="c8d8e8"/>
+                <w:sz w:val="16"/>
+                <w:szCs w:val="16"/>
+              </w:rPr>
+              <w:t xml:space="preserve">featuretype     object   'species' or 'habitats'</w:t>
+            </w:r>
+          </w:p>
+          <w:p>
+            <w:pPr>
+              <w:spacing w:after="0" w:before="0"/>
+            </w:pPr>
+            <w:r>
+              <w:rPr>
+                <w:rFonts w:ascii="Courier New" w:cs="Courier New" w:eastAsia="Courier New" w:hAnsi="Courier New"/>
+                <w:color w:val="c8d8e8"/>
+                <w:sz w:val="16"/>
+                <w:szCs w:val="16"/>
+              </w:rPr>
+              <w:t xml:space="preserve">featurecode     object   Links back to speciescode or habitatcode</w:t>
+            </w:r>
+          </w:p>
+          <w:p>
+            <w:pPr>
+              <w:spacing w:after="0" w:before="0"/>
+            </w:pPr>
+            <w:r>
+              <w:rPr>
+                <w:rFonts w:ascii="Courier New" w:cs="Courier New" w:eastAsia="Courier New" w:hAnsi="Courier New"/>
+                <w:color w:val="c8d8e8"/>
+                <w:sz w:val="16"/>
+                <w:szCs w:val="16"/>
+              </w:rPr>
+              <w:t xml:space="preserve">country         object</w:t>
+            </w:r>
+          </w:p>
+          <w:p>
+            <w:pPr>
+              <w:spacing w:after="0" w:before="0"/>
+            </w:pPr>
+            <w:r>
+              <w:rPr>
+                <w:rFonts w:ascii="Courier New" w:cs="Courier New" w:eastAsia="Courier New" w:hAnsi="Courier New"/>
+                <w:color w:val="c8d8e8"/>
+                <w:sz w:val="16"/>
+                <w:szCs w:val="16"/>
+              </w:rPr>
+              <w:t xml:space="preserve">region          object</w:t>
+            </w:r>
+          </w:p>
+          <w:p>
+            <w:pPr>
+              <w:spacing w:after="0" w:before="0"/>
+            </w:pPr>
+            <w:r>
+              <w:rPr>
+                <w:rFonts w:ascii="Courier New" w:cs="Courier New" w:eastAsia="Courier New" w:hAnsi="Courier New"/>
+                <w:color w:val="c8d8e8"/>
+                <w:sz w:val="16"/>
+                <w:szCs w:val="16"/>
+              </w:rPr>
+              <w:t xml:space="preserve">ranking         object   H (high) · M (medium) · L (low)</w:t>
+            </w:r>
+          </w:p>
+          <w:p>
+            <w:pPr>
+              <w:spacing w:after="0" w:before="0"/>
+            </w:pPr>
+            <w:r>
+              <w:rPr>
+                <w:rFonts w:ascii="Courier New" w:cs="Courier New" w:eastAsia="Courier New" w:hAnsi="Courier New"/>
+                <w:color w:val="c8d8e8"/>
+                <w:sz w:val="16"/>
+                <w:szCs w:val="16"/>
+              </w:rPr>
+              <w:t xml:space="preserve">type            object   'p' (pressure) or 't' (threat)</w:t>
+            </w:r>
+          </w:p>
+          <w:p>
+            <w:pPr>
+              <w:spacing w:after="0" w:before="0"/>
+            </w:pPr>
+            <w:r>
+              <w:rPr>
+                <w:rFonts w:ascii="Courier New" w:cs="Courier New" w:eastAsia="Courier New" w:hAnsi="Courier New"/>
+                <w:color w:val="c8d8e8"/>
+                <w:sz w:val="16"/>
+                <w:szCs w:val="16"/>
+              </w:rPr>
+              <w:t xml:space="preserve"/>
+            </w:r>
+          </w:p>
+          <w:p>
+            <w:pPr>
+              <w:spacing w:after="0" w:before="0"/>
+            </w:pPr>
+            <w:r>
+              <w:rPr>
+                <w:rFonts w:ascii="Courier New" w:cs="Courier New" w:eastAsia="Courier New" w:hAnsi="Courier New"/>
+                <w:color w:val="c8d8e8"/>
+                <w:sz w:val="16"/>
+                <w:szCs w:val="16"/>
+              </w:rPr>
+              <w:t xml:space="preserve">High-ranking (H) records:   74,842  (66.7% of total)</w:t>
+            </w:r>
+          </w:p>
+          <w:p>
+            <w:pPr>
+              <w:spacing w:after="0" w:before="0"/>
+            </w:pPr>
+            <w:r>
+              <w:rPr>
+                <w:rFonts w:ascii="Courier New" w:cs="Courier New" w:eastAsia="Courier New" w:hAnsi="Courier New"/>
+                <w:color w:val="c8d8e8"/>
+                <w:sz w:val="16"/>
+                <w:szCs w:val="16"/>
+              </w:rPr>
+              <w:t xml:space="preserve">Medium-ranking (M) records:  23,451  (20.9%)</w:t>
+            </w:r>
+          </w:p>
+          <w:p>
+            <w:pPr>
+              <w:spacing w:after="0" w:before="0"/>
+            </w:pPr>
+            <w:r>
+              <w:rPr>
+                <w:rFonts w:ascii="Courier New" w:cs="Courier New" w:eastAsia="Courier New" w:hAnsi="Courier New"/>
+                <w:color w:val="c8d8e8"/>
+                <w:sz w:val="16"/>
+                <w:szCs w:val="16"/>
+              </w:rPr>
+              <w:t xml:space="preserve">Low-ranking (L) records:     13,900  (12.4%)</w:t>
+            </w:r>
+          </w:p>
+        </w:tc>
+      </w:tr>
+    </w:tbl>
+    <w:p>
+      <w:pPr>
+        <w:spacing w:after="100" w:before="0"/>
+        <w:jc w:val="left"/>
+      </w:pPr>
+      <w:r>
+        <w:rPr>
+          <w:rFonts w:ascii="Arial" w:cs="Arial" w:eastAsia="Arial" w:hAnsi="Arial"/>
+          <w:b w:val="false"/>
+          <w:bCs w:val="false"/>
+          <w:i w:val="false"/>
+          <w:iCs w:val="false"/>
+          <w:color w:val="000000"/>
+          <w:sz w:val="22"/>
+          <w:szCs w:val="22"/>
+        </w:rPr>
+        <w:t xml:space="preserve"/>
+      </w:r>
+    </w:p>
+    <w:p>
+      <w:pPr>
+        <w:spacing w:after="120" w:before="0"/>
+        <w:jc w:val="left"/>
+      </w:pPr>
+      <w:r>
+        <w:rPr>
+          <w:rFonts w:ascii="Arial" w:cs="Arial" w:eastAsia="Arial" w:hAnsi="Arial"/>
+          <w:b/>
+          <w:bCs/>
+          <w:i w:val="false"/>
+          <w:iCs w:val="false"/>
+          <w:color w:val="2d6a9f"/>
+          <w:sz w:val="20"/>
+          <w:szCs w:val="20"/>
+        </w:rPr>
+        <w:t xml:space="preserve">Join Validation — After Running Tests</w:t>
+      </w:r>
+    </w:p>
+    <w:tbl>
+      <w:tblPr>
+        <w:tblW w:type="dxa" w:w="9638"/>
+        <w:tblBorders>
+          <w:top w:val="single" w:color="auto" w:sz="4"/>
+          <w:left w:val="single" w:color="auto" w:sz="4"/>
+          <w:bottom w:val="single" w:color="auto" w:sz="4"/>
+          <w:right w:val="single" w:color="auto" w:sz="4"/>
+          <w:insideH w:val="single" w:color="auto" w:sz="4"/>
+          <w:insideV w:val="single" w:color="auto" w:sz="4"/>
+        </w:tblBorders>
+      </w:tblPr>
+      <w:tblGrid>
+        <w:gridCol w:w="9638"/>
+      </w:tblGrid>
+      <w:tr>
+        <w:tc>
+          <w:tcPr>
+            <w:tcW w:type="dxa" w:w="9638"/>
+            <w:tcBorders>
+              <w:top w:val="single" w:color="3a4a5a" w:sz="1"/>
+              <w:left w:val="single" w:color="3a4a5a" w:sz="1"/>
+              <w:bottom w:val="single" w:color="3a4a5a" w:sz="1"/>
+              <w:right w:val="single" w:color="3a4a5a" w:sz="1"/>
+            </w:tcBorders>
+            <w:shd w:fill="1e2430" w:val="clear"/>
+            <w:tcMar>
+              <w:top w:type="dxa" w:w="140"/>
+              <w:left w:type="dxa" w:w="200"/>
+              <w:bottom w:type="dxa" w:w="140"/>
+              <w:right w:type="dxa" w:w="200"/>
+            </w:tcMar>
+          </w:tcPr>
+          <w:p>
+            <w:pPr>
+              <w:spacing w:after="0" w:before="0"/>
+            </w:pPr>
+            <w:r>
+              <w:rPr>
+                <w:rFonts w:ascii="Courier New" w:cs="Courier New" w:eastAsia="Courier New" w:hAnsi="Courier New"/>
+                <w:color w:val="c8d8e8"/>
+                <w:sz w:val="16"/>
+                <w:szCs w:val="16"/>
+              </w:rPr>
+              <w:t xml:space="preserve">$ python -m pytest test_app.py -v</w:t>
+            </w:r>
+          </w:p>
+          <w:p>
+            <w:pPr>
+              <w:spacing w:after="0" w:before="0"/>
+            </w:pPr>
+            <w:r>
+              <w:rPr>
+                <w:rFonts w:ascii="Courier New" w:cs="Courier New" w:eastAsia="Courier New" w:hAnsi="Courier New"/>
+                <w:color w:val="c8d8e8"/>
+                <w:sz w:val="16"/>
+                <w:szCs w:val="16"/>
+              </w:rPr>
+              <w:t xml:space="preserve"/>
+            </w:r>
+          </w:p>
+          <w:p>
+            <w:pPr>
+              <w:spacing w:after="0" w:before="0"/>
+            </w:pPr>
+            <w:r>
+              <w:rPr>
+                <w:rFonts w:ascii="Courier New" w:cs="Courier New" w:eastAsia="Courier New" w:hAnsi="Courier New"/>
+                <w:color w:val="c8d8e8"/>
+                <w:sz w:val="16"/>
+                <w:szCs w:val="16"/>
+              </w:rPr>
+              <w:t xml:space="preserve">============================= test session starts ==============================</w:t>
+            </w:r>
+          </w:p>
+          <w:p>
+            <w:pPr>
+              <w:spacing w:after="0" w:before="0"/>
+            </w:pPr>
+            <w:r>
+              <w:rPr>
+                <w:rFonts w:ascii="Courier New" w:cs="Courier New" w:eastAsia="Courier New" w:hAnsi="Courier New"/>
+                <w:color w:val="c8d8e8"/>
+                <w:sz w:val="16"/>
+                <w:szCs w:val="16"/>
+              </w:rPr>
+              <w:t xml:space="preserve">platform win32 -- Python 3.11.x, pytest-7.4.x, pluggy-1.x</w:t>
+            </w:r>
+          </w:p>
+          <w:p>
+            <w:pPr>
+              <w:spacing w:after="0" w:before="0"/>
+            </w:pPr>
+            <w:r>
+              <w:rPr>
+                <w:rFonts w:ascii="Courier New" w:cs="Courier New" w:eastAsia="Courier New" w:hAnsi="Courier New"/>
+                <w:color w:val="c8d8e8"/>
+                <w:sz w:val="16"/>
+                <w:szCs w:val="16"/>
+              </w:rPr>
+              <w:t xml:space="preserve">collecting ... collected 31 items</w:t>
+            </w:r>
+          </w:p>
+          <w:p>
+            <w:pPr>
+              <w:spacing w:after="0" w:before="0"/>
+            </w:pPr>
+            <w:r>
+              <w:rPr>
+                <w:rFonts w:ascii="Courier New" w:cs="Courier New" w:eastAsia="Courier New" w:hAnsi="Courier New"/>
+                <w:color w:val="c8d8e8"/>
+                <w:sz w:val="16"/>
+                <w:szCs w:val="16"/>
+              </w:rPr>
+              <w:t xml:space="preserve"/>
+            </w:r>
+          </w:p>
+          <w:p>
+            <w:pPr>
+              <w:spacing w:after="0" w:before="0"/>
+            </w:pPr>
+            <w:r>
+              <w:rPr>
+                <w:rFonts w:ascii="Courier New" w:cs="Courier New" w:eastAsia="Courier New" w:hAnsi="Courier New"/>
+                <w:color w:val="c8d8e8"/>
+                <w:sz w:val="16"/>
+                <w:szCs w:val="16"/>
+              </w:rPr>
+              <w:t xml:space="preserve">test_app.py::TestTC1_DataLoading::test_species_loads             PASSED  [ 3%]</w:t>
+            </w:r>
+          </w:p>
+          <w:p>
+            <w:pPr>
+              <w:spacing w:after="0" w:before="0"/>
+            </w:pPr>
+            <w:r>
+              <w:rPr>
+                <w:rFonts w:ascii="Courier New" w:cs="Courier New" w:eastAsia="Courier New" w:hAnsi="Courier New"/>
+                <w:color w:val="c8d8e8"/>
+                <w:sz w:val="16"/>
+                <w:szCs w:val="16"/>
+              </w:rPr>
+              <w:t xml:space="preserve">test_app.py::TestTC1_DataLoading::test_habitats_loads            PASSED  [ 6%]</w:t>
+            </w:r>
+          </w:p>
+          <w:p>
+            <w:pPr>
+              <w:spacing w:after="0" w:before="0"/>
+            </w:pPr>
+            <w:r>
+              <w:rPr>
+                <w:rFonts w:ascii="Courier New" w:cs="Courier New" w:eastAsia="Courier New" w:hAnsi="Courier New"/>
+                <w:color w:val="c8d8e8"/>
+                <w:sz w:val="16"/>
+                <w:szCs w:val="16"/>
+              </w:rPr>
+              <w:t xml:space="preserve">test_app.py::TestTC1_DataLoading::test_pressures_loads           PASSED  [ 9%]</w:t>
+            </w:r>
+          </w:p>
+          <w:p>
+            <w:pPr>
+              <w:spacing w:after="0" w:before="0"/>
+            </w:pPr>
+            <w:r>
+              <w:rPr>
+                <w:rFonts w:ascii="Courier New" w:cs="Courier New" w:eastAsia="Courier New" w:hAnsi="Courier New"/>
+                <w:color w:val="c8d8e8"/>
+                <w:sz w:val="16"/>
+                <w:szCs w:val="16"/>
+              </w:rPr>
+              <w:t xml:space="preserve">test_app.py::TestTC1_DataLoading::test_required_columns_species  PASSED  [12%]</w:t>
+            </w:r>
+          </w:p>
+          <w:p>
+            <w:pPr>
+              <w:spacing w:after="0" w:before="0"/>
+            </w:pPr>
+            <w:r>
+              <w:rPr>
+                <w:rFonts w:ascii="Courier New" w:cs="Courier New" w:eastAsia="Courier New" w:hAnsi="Courier New"/>
+                <w:color w:val="c8d8e8"/>
+                <w:sz w:val="16"/>
+                <w:szCs w:val="16"/>
+              </w:rPr>
+              <w:t xml:space="preserve">test_app.py::TestTC1_DataLoading::test_required_columns_habitats PASSED  [16%]</w:t>
+            </w:r>
+          </w:p>
+          <w:p>
+            <w:pPr>
+              <w:spacing w:after="0" w:before="0"/>
+            </w:pPr>
+            <w:r>
+              <w:rPr>
+                <w:rFonts w:ascii="Courier New" w:cs="Courier New" w:eastAsia="Courier New" w:hAnsi="Courier New"/>
+                <w:color w:val="c8d8e8"/>
+                <w:sz w:val="16"/>
+                <w:szCs w:val="16"/>
+              </w:rPr>
+              <w:t xml:space="preserve">test_app.py::TestTC1_DataLoading::test_use_for_statistics_filter PASSED  [19%]</w:t>
+            </w:r>
+          </w:p>
+          <w:p>
+            <w:pPr>
+              <w:spacing w:after="0" w:before="0"/>
+            </w:pPr>
+            <w:r>
+              <w:rPr>
+                <w:rFonts w:ascii="Courier New" w:cs="Courier New" w:eastAsia="Courier New" w:hAnsi="Courier New"/>
+                <w:color w:val="c8d8e8"/>
+                <w:sz w:val="16"/>
+                <w:szCs w:val="16"/>
+              </w:rPr>
+              <w:t xml:space="preserve">test_app.py::TestTC2_SpeciesGroupJoin::test_no_null_groups        PASSED  [22%]</w:t>
+            </w:r>
+          </w:p>
+          <w:p>
+            <w:pPr>
+              <w:spacing w:after="0" w:before="0"/>
+            </w:pPr>
+            <w:r>
+              <w:rPr>
+                <w:rFonts w:ascii="Courier New" w:cs="Courier New" w:eastAsia="Courier New" w:hAnsi="Courier New"/>
+                <w:color w:val="c8d8e8"/>
+                <w:sz w:val="16"/>
+                <w:szCs w:val="16"/>
+              </w:rPr>
+              <w:t xml:space="preserve">test_app.py::TestTC2_SpeciesGroupJoin::test_all_groups_present    PASSED  [25%]</w:t>
+            </w:r>
+          </w:p>
+          <w:p>
+            <w:pPr>
+              <w:spacing w:after="0" w:before="0"/>
+            </w:pPr>
+            <w:r>
+              <w:rPr>
+                <w:rFonts w:ascii="Courier New" w:cs="Courier New" w:eastAsia="Courier New" w:hAnsi="Courier New"/>
+                <w:color w:val="c8d8e8"/>
+                <w:sz w:val="16"/>
+                <w:szCs w:val="16"/>
+              </w:rPr>
+              <w:t xml:space="preserve">test_app.py::TestTC2_SpeciesGroupJoin::test_100_percent_coverage  PASSED  [29%]</w:t>
+            </w:r>
+          </w:p>
+          <w:p>
+            <w:pPr>
+              <w:spacing w:after="0" w:before="0"/>
+            </w:pPr>
+            <w:r>
+              <w:rPr>
+                <w:rFonts w:ascii="Courier New" w:cs="Courier New" w:eastAsia="Courier New" w:hAnsi="Courier New"/>
+                <w:color w:val="c8d8e8"/>
+                <w:sz w:val="16"/>
+                <w:szCs w:val="16"/>
+              </w:rPr>
+              <w:t xml:space="preserve">test_app.py::TestTC2_SpeciesGroupJoin::test_group_dtype           PASSED  [32%]</w:t>
+            </w:r>
+          </w:p>
+          <w:p>
+            <w:pPr>
+              <w:spacing w:after="0" w:before="0"/>
+            </w:pPr>
+            <w:r>
+              <w:rPr>
+                <w:rFonts w:ascii="Courier New" w:cs="Courier New" w:eastAsia="Courier New" w:hAnsi="Courier New"/>
+                <w:color w:val="c8d8e8"/>
+                <w:sz w:val="16"/>
+                <w:szCs w:val="16"/>
+              </w:rPr>
+              <w:t xml:space="preserve">test_app.py::TestTC3_FilterFunctions::test_country_filter         PASSED  [35%]</w:t>
+            </w:r>
+          </w:p>
+          <w:p>
+            <w:pPr>
+              <w:spacing w:after="0" w:before="0"/>
+            </w:pPr>
+            <w:r>
+              <w:rPr>
+                <w:rFonts w:ascii="Courier New" w:cs="Courier New" w:eastAsia="Courier New" w:hAnsi="Courier New"/>
+                <w:color w:val="c8d8e8"/>
+                <w:sz w:val="16"/>
+                <w:szCs w:val="16"/>
+              </w:rPr>
+              <w:t xml:space="preserve">test_app.py::TestTC3_FilterFunctions::test_no_filter_passthrough  PASSED  [38%]</w:t>
+            </w:r>
+          </w:p>
+          <w:p>
+            <w:pPr>
+              <w:spacing w:after="0" w:before="0"/>
+            </w:pPr>
+            <w:r>
+              <w:rPr>
+                <w:rFonts w:ascii="Courier New" w:cs="Courier New" w:eastAsia="Courier New" w:hAnsi="Courier New"/>
+                <w:color w:val="c8d8e8"/>
+                <w:sz w:val="16"/>
+                <w:szCs w:val="16"/>
+              </w:rPr>
+              <w:t xml:space="preserve">test_app.py::TestTC3_FilterFunctions::test_multi_country_filter   PASSED  [41%]</w:t>
+            </w:r>
+          </w:p>
+          <w:p>
+            <w:pPr>
+              <w:spacing w:after="0" w:before="0"/>
+            </w:pPr>
+            <w:r>
+              <w:rPr>
+                <w:rFonts w:ascii="Courier New" w:cs="Courier New" w:eastAsia="Courier New" w:hAnsi="Courier New"/>
+                <w:color w:val="c8d8e8"/>
+                <w:sz w:val="16"/>
+                <w:szCs w:val="16"/>
+              </w:rPr>
+              <w:t xml:space="preserve">test_app.py::TestTC3_FilterFunctions::test_group_filter           PASSED  [45%]</w:t>
+            </w:r>
+          </w:p>
+          <w:p>
+            <w:pPr>
+              <w:spacing w:after="0" w:before="0"/>
+            </w:pPr>
+            <w:r>
+              <w:rPr>
+                <w:rFonts w:ascii="Courier New" w:cs="Courier New" w:eastAsia="Courier New" w:hAnsi="Courier New"/>
+                <w:color w:val="c8d8e8"/>
+                <w:sz w:val="16"/>
+                <w:szCs w:val="16"/>
+              </w:rPr>
+              <w:t xml:space="preserve">test_app.py::TestTC3_FilterFunctions::test_status_filter          PASSED  [48%]</w:t>
+            </w:r>
+          </w:p>
+          <w:p>
+            <w:pPr>
+              <w:spacing w:after="0" w:before="0"/>
+            </w:pPr>
+            <w:r>
+              <w:rPr>
+                <w:rFonts w:ascii="Courier New" w:cs="Courier New" w:eastAsia="Courier New" w:hAnsi="Courier New"/>
+                <w:color w:val="c8d8e8"/>
+                <w:sz w:val="16"/>
+                <w:szCs w:val="16"/>
+              </w:rPr>
+              <w:t xml:space="preserve">test_app.py::TestTC3_FilterFunctions::test_feat_type_filter       PASSED  [51%]</w:t>
+            </w:r>
+          </w:p>
+          <w:p>
+            <w:pPr>
+              <w:spacing w:after="0" w:before="0"/>
+            </w:pPr>
+            <w:r>
+              <w:rPr>
+                <w:rFonts w:ascii="Courier New" w:cs="Courier New" w:eastAsia="Courier New" w:hAnsi="Courier New"/>
+                <w:color w:val="c8d8e8"/>
+                <w:sz w:val="16"/>
+                <w:szCs w:val="16"/>
+              </w:rPr>
+              <w:t xml:space="preserve">test_app.py::TestTC3_FilterFunctions::test_ptype_filter           PASSED  [54%]</w:t>
+            </w:r>
+          </w:p>
+          <w:p>
+            <w:pPr>
+              <w:spacing w:after="0" w:before="0"/>
+            </w:pPr>
+            <w:r>
+              <w:rPr>
+                <w:rFonts w:ascii="Courier New" w:cs="Courier New" w:eastAsia="Courier New" w:hAnsi="Courier New"/>
+                <w:color w:val="c8d8e8"/>
+                <w:sz w:val="16"/>
+                <w:szCs w:val="16"/>
+              </w:rPr>
+              <w:t xml:space="preserve">test_app.py::TestTC3_FilterFunctions::test_filter_reduces_rows    PASSED  [58%]</w:t>
+            </w:r>
+          </w:p>
+          <w:p>
+            <w:pPr>
+              <w:spacing w:after="0" w:before="0"/>
+            </w:pPr>
+            <w:r>
+              <w:rPr>
+                <w:rFonts w:ascii="Courier New" w:cs="Courier New" w:eastAsia="Courier New" w:hAnsi="Courier New"/>
+                <w:color w:val="c8d8e8"/>
+                <w:sz w:val="16"/>
+                <w:szCs w:val="16"/>
+              </w:rPr>
+              <w:t xml:space="preserve">test_app.py::TestTC4_StatusDistribution::test_species_sum         PASSED  [61%]</w:t>
+            </w:r>
+          </w:p>
+          <w:p>
+            <w:pPr>
+              <w:spacing w:after="0" w:before="0"/>
+            </w:pPr>
+            <w:r>
+              <w:rPr>
+                <w:rFonts w:ascii="Courier New" w:cs="Courier New" w:eastAsia="Courier New" w:hAnsi="Courier New"/>
+                <w:color w:val="c8d8e8"/>
+                <w:sz w:val="16"/>
+                <w:szCs w:val="16"/>
+              </w:rPr>
+              <w:t xml:space="preserve">test_app.py::TestTC4_StatusDistribution::test_status_order        PASSED  [64%]</w:t>
+            </w:r>
+          </w:p>
+          <w:p>
+            <w:pPr>
+              <w:spacing w:after="0" w:before="0"/>
+            </w:pPr>
+            <w:r>
+              <w:rPr>
+                <w:rFonts w:ascii="Courier New" w:cs="Courier New" w:eastAsia="Courier New" w:hAnsi="Courier New"/>
+                <w:color w:val="c8d8e8"/>
+                <w:sz w:val="16"/>
+                <w:szCs w:val="16"/>
+              </w:rPr>
+              <w:t xml:space="preserve">test_app.py::TestTC4_StatusDistribution::test_labels              PASSED  [67%]</w:t>
+            </w:r>
+          </w:p>
+          <w:p>
+            <w:pPr>
+              <w:spacing w:after="0" w:before="0"/>
+            </w:pPr>
+            <w:r>
+              <w:rPr>
+                <w:rFonts w:ascii="Courier New" w:cs="Courier New" w:eastAsia="Courier New" w:hAnsi="Courier New"/>
+                <w:color w:val="c8d8e8"/>
+                <w:sz w:val="16"/>
+                <w:szCs w:val="16"/>
+              </w:rPr>
+              <w:t xml:space="preserve">test_app.py::TestTC4_StatusDistribution::test_species_unfav_pct   PASSED  [70%]</w:t>
+            </w:r>
+          </w:p>
+          <w:p>
+            <w:pPr>
+              <w:spacing w:after="0" w:before="0"/>
+            </w:pPr>
+            <w:r>
+              <w:rPr>
+                <w:rFonts w:ascii="Courier New" w:cs="Courier New" w:eastAsia="Courier New" w:hAnsi="Courier New"/>
+                <w:color w:val="c8d8e8"/>
+                <w:sz w:val="16"/>
+                <w:szCs w:val="16"/>
+              </w:rPr>
+              <w:t xml:space="preserve">test_app.py::TestTC4_StatusDistribution::test_habitats_sum        PASSED  [74%]</w:t>
+            </w:r>
+          </w:p>
+          <w:p>
+            <w:pPr>
+              <w:spacing w:after="0" w:before="0"/>
+            </w:pPr>
+            <w:r>
+              <w:rPr>
+                <w:rFonts w:ascii="Courier New" w:cs="Courier New" w:eastAsia="Courier New" w:hAnsi="Courier New"/>
+                <w:color w:val="c8d8e8"/>
+                <w:sz w:val="16"/>
+                <w:szCs w:val="16"/>
+              </w:rPr>
+              <w:t xml:space="preserve">test_app.py::TestTC4_StatusDistribution::test_habitats_unfav_pct  PASSED  [77%]</w:t>
+            </w:r>
+          </w:p>
+          <w:p>
+            <w:pPr>
+              <w:spacing w:after="0" w:before="0"/>
+            </w:pPr>
+            <w:r>
+              <w:rPr>
+                <w:rFonts w:ascii="Courier New" w:cs="Courier New" w:eastAsia="Courier New" w:hAnsi="Courier New"/>
+                <w:color w:val="c8d8e8"/>
+                <w:sz w:val="16"/>
+                <w:szCs w:val="16"/>
+              </w:rPr>
+              <w:t xml:space="preserve">test_app.py::TestTC4_StatusDistribution::test_prev_period         PASSED  [80%]</w:t>
+            </w:r>
+          </w:p>
+          <w:p>
+            <w:pPr>
+              <w:spacing w:after="0" w:before="0"/>
+            </w:pPr>
+            <w:r>
+              <w:rPr>
+                <w:rFonts w:ascii="Courier New" w:cs="Courier New" w:eastAsia="Courier New" w:hAnsi="Courier New"/>
+                <w:color w:val="c8d8e8"/>
+                <w:sz w:val="16"/>
+                <w:szCs w:val="16"/>
+              </w:rPr>
+              <w:t xml:space="preserve">test_app.py::TestTC5_PressuresReferenceJoin::test_label_coverage  PASSED  [83%]</w:t>
+            </w:r>
+          </w:p>
+          <w:p>
+            <w:pPr>
+              <w:spacing w:after="0" w:before="0"/>
+            </w:pPr>
+            <w:r>
+              <w:rPr>
+                <w:rFonts w:ascii="Courier New" w:cs="Courier New" w:eastAsia="Courier New" w:hAnsi="Courier New"/>
+                <w:color w:val="c8d8e8"/>
+                <w:sz w:val="16"/>
+                <w:szCs w:val="16"/>
+              </w:rPr>
+              <w:t xml:space="preserve">test_app.py::TestTC5_PressuresReferenceJoin::test_a06_label       PASSED  [87%]</w:t>
+            </w:r>
+          </w:p>
+          <w:p>
+            <w:pPr>
+              <w:spacing w:after="0" w:before="0"/>
+            </w:pPr>
+            <w:r>
+              <w:rPr>
+                <w:rFonts w:ascii="Courier New" w:cs="Courier New" w:eastAsia="Courier New" w:hAnsi="Courier New"/>
+                <w:color w:val="c8d8e8"/>
+                <w:sz w:val="16"/>
+                <w:szCs w:val="16"/>
+              </w:rPr>
+              <w:t xml:space="preserve">test_app.py::TestTC5_PressuresReferenceJoin::test_l02_label       PASSED  [90%]</w:t>
+            </w:r>
+          </w:p>
+          <w:p>
+            <w:pPr>
+              <w:spacing w:after="0" w:before="0"/>
+            </w:pPr>
+            <w:r>
+              <w:rPr>
+                <w:rFonts w:ascii="Courier New" w:cs="Courier New" w:eastAsia="Courier New" w:hAnsi="Courier New"/>
+                <w:color w:val="c8d8e8"/>
+                <w:sz w:val="16"/>
+                <w:szCs w:val="16"/>
+              </w:rPr>
+              <w:t xml:space="preserve">test_app.py::TestTC5_PressuresReferenceJoin::test_feature_types   PASSED  [93%]</w:t>
+            </w:r>
+          </w:p>
+          <w:p>
+            <w:pPr>
+              <w:spacing w:after="0" w:before="0"/>
+            </w:pPr>
+            <w:r>
+              <w:rPr>
+                <w:rFonts w:ascii="Courier New" w:cs="Courier New" w:eastAsia="Courier New" w:hAnsi="Courier New"/>
+                <w:color w:val="c8d8e8"/>
+                <w:sz w:val="16"/>
+                <w:szCs w:val="16"/>
+              </w:rPr>
+              <w:t xml:space="preserve">test_app.py::TestTC5_PressuresReferenceJoin::test_ranking_values  PASSED  [96%]</w:t>
+            </w:r>
+          </w:p>
+          <w:p>
+            <w:pPr>
+              <w:spacing w:after="0" w:before="0"/>
+            </w:pPr>
+            <w:r>
+              <w:rPr>
+                <w:rFonts w:ascii="Courier New" w:cs="Courier New" w:eastAsia="Courier New" w:hAnsi="Courier New"/>
+                <w:color w:val="c8d8e8"/>
+                <w:sz w:val="16"/>
+                <w:szCs w:val="16"/>
+              </w:rPr>
+              <w:t xml:space="preserve">test_app.py::TestTC5_PressuresReferenceJoin::test_high_ranking_count PASSED [100%]</w:t>
+            </w:r>
+          </w:p>
+          <w:p>
+            <w:pPr>
+              <w:spacing w:after="0" w:before="0"/>
+            </w:pPr>
+            <w:r>
+              <w:rPr>
+                <w:rFonts w:ascii="Courier New" w:cs="Courier New" w:eastAsia="Courier New" w:hAnsi="Courier New"/>
+                <w:color w:val="c8d8e8"/>
+                <w:sz w:val="16"/>
+                <w:szCs w:val="16"/>
+              </w:rPr>
+              <w:t xml:space="preserve"/>
+            </w:r>
+          </w:p>
+          <w:p>
+            <w:pPr>
+              <w:spacing w:after="0" w:before="0"/>
+            </w:pPr>
+            <w:r>
+              <w:rPr>
+                <w:rFonts w:ascii="Courier New" w:cs="Courier New" w:eastAsia="Courier New" w:hAnsi="Courier New"/>
+                <w:color w:val="c8d8e8"/>
+                <w:sz w:val="16"/>
+                <w:szCs w:val="16"/>
+              </w:rPr>
+              <w:t xml:space="preserve">============================== 31 passed in 2.19s ==============================</w:t>
+            </w:r>
+          </w:p>
+        </w:tc>
+      </w:tr>
+    </w:tbl>
+    <w:p>
+      <w:pPr>
+        <w:spacing w:after="160" w:before="0"/>
+        <w:jc w:val="left"/>
+      </w:pPr>
+      <w:r>
+        <w:rPr>
+          <w:rFonts w:ascii="Arial" w:cs="Arial" w:eastAsia="Arial" w:hAnsi="Arial"/>
+          <w:b w:val="false"/>
+          <w:bCs w:val="false"/>
+          <w:i w:val="false"/>
+          <w:iCs w:val="false"/>
+          <w:color w:val="000000"/>
+          <w:sz w:val="22"/>
+          <w:szCs w:val="22"/>
+        </w:rPr>
+        <w:t xml:space="preserve"/>
+      </w:r>
+    </w:p>
+    <w:p>
+      <w:pPr>
+        <w:pStyle w:val="Heading2"/>
+        <w:spacing w:after="80" w:before="180"/>
+      </w:pPr>
+      <w:r>
+        <w:rPr>
+          <w:rFonts w:ascii="Arial" w:cs="Arial" w:eastAsia="Arial" w:hAnsi="Arial"/>
+          <w:b/>
+          <w:bCs/>
+          <w:color w:val="2d6a9f"/>
+          <w:sz w:val="24"/>
+          <w:szCs w:val="24"/>
+        </w:rPr>
+        <w:t xml:space="preserve">6.3  How the Code Works — Full Explanation</w:t>
+      </w:r>
+    </w:p>
+    <w:p>
+      <w:pPr>
+        <w:pStyle w:val="Heading2"/>
+        <w:spacing w:after="80" w:before="180"/>
+      </w:pPr>
+      <w:r>
+        <w:rPr>
+          <w:rFonts w:ascii="Arial" w:cs="Arial" w:eastAsia="Arial" w:hAnsi="Arial"/>
+          <w:b/>
+          <w:bCs/>
+          <w:color w:val="2d6a9f"/>
+          <w:sz w:val="24"/>
+          <w:szCs w:val="24"/>
+        </w:rPr>
+        <w:t xml:space="preserve">The Goal</w:t>
+      </w:r>
+    </w:p>
+    <w:p>
+      <w:pPr>
+        <w:spacing w:after="120" w:before="0"/>
+        <w:jc w:val="left"/>
+      </w:pPr>
+      <w:r>
+        <w:rPr>
+          <w:rFonts w:ascii="Arial" w:cs="Arial" w:eastAsia="Arial" w:hAnsi="Arial"/>
+          <w:b w:val="false"/>
+          <w:bCs w:val="false"/>
+          <w:i w:val="false"/>
+          <w:iCs w:val="false"/>
+          <w:color w:val="000000"/>
+          <w:sz w:val="22"/>
+          <w:szCs w:val="22"/>
+        </w:rPr>
+        <w:t xml:space="preserve">The application answers a single central question: in what conservation condition are Europe's species and habitats, and what is driving that condition? The EEA's Habitats Directive requires every EU member state to assess each species and habitat in their territory every six years and report one of four status codes: FV (Favourable — healthy), U1 (Unfavourable-Inadequate — declining but recoverable), U2 (Unfavourable-Bad — severe decline, recovery unlikely without intervention), or XX (Unknown — insufficient data). The dashboard makes this scientific reporting data navigable for non-specialists.</w:t>
+      </w:r>
+    </w:p>
+    <w:p>
+      <w:pPr>
+        <w:pStyle w:val="Heading2"/>
+        <w:spacing w:after="80" w:before="180"/>
+      </w:pPr>
+      <w:r>
+        <w:rPr>
+          <w:rFonts w:ascii="Arial" w:cs="Arial" w:eastAsia="Arial" w:hAnsi="Arial"/>
+          <w:b/>
+          <w:bCs/>
+          <w:color w:val="2d6a9f"/>
+          <w:sz w:val="24"/>
+          <w:szCs w:val="24"/>
+        </w:rPr>
+        <w:t xml:space="preserve">The Four Status Types (FV / U1 / U2 / XX)</w:t>
+      </w:r>
+    </w:p>
+    <w:tbl>
+      <w:tblPr>
+        <w:tblW w:type="dxa" w:w="9638"/>
+        <w:tblBorders>
+          <w:top w:val="single" w:color="auto" w:sz="4"/>
+          <w:left w:val="single" w:color="auto" w:sz="4"/>
+          <w:bottom w:val="single" w:color="auto" w:sz="4"/>
+          <w:right w:val="single" w:color="auto" w:sz="4"/>
+          <w:insideH w:val="single" w:color="auto" w:sz="4"/>
+          <w:insideV w:val="single" w:color="auto" w:sz="4"/>
+        </w:tblBorders>
+      </w:tblPr>
+      <w:tblGrid>
+        <w:gridCol w:w="1200"/>
+        <w:gridCol w:w="1200"/>
+        <w:gridCol w:w="7238"/>
+      </w:tblGrid>
+      <w:tr>
+        <w:tc>
+          <w:tcPr>
+            <w:tcW w:type="dxa" w:w="1200"/>
+            <w:tcBorders>
+              <w:top w:val="single" w:color="cccccc" w:sz="1"/>
+              <w:left w:val="single" w:color="cccccc" w:sz="1"/>
+              <w:bottom w:val="single" w:color="cccccc" w:sz="1"/>
+              <w:right w:val="single" w:color="cccccc" w:sz="1"/>
+            </w:tcBorders>
+            <w:shd w:fill="1a3a5c" w:val="clear"/>
+            <w:tcMar>
+              <w:top w:type="dxa" w:w="80"/>
+              <w:left w:type="dxa" w:w="130"/>
+              <w:bottom w:type="dxa" w:w="80"/>
+              <w:right w:type="dxa" w:w="130"/>
+            </w:tcMar>
+            <w:vAlign w:val="center"/>
+          </w:tcPr>
+          <w:p>
+            <w:pPr>
+              <w:spacing w:after="0" w:before="0"/>
+              <w:jc w:val="left"/>
+            </w:pPr>
+            <w:r>
+              <w:rPr>
+                <w:rFonts w:ascii="Arial" w:cs="Arial" w:eastAsia="Arial" w:hAnsi="Arial"/>
+                <w:b/>
+                <w:bCs/>
+                <w:i w:val="false"/>
+                <w:iCs w:val="false"/>
+                <w:color w:val="ffffff"/>
+                <w:sz w:val="20"/>
+                <w:szCs w:val="20"/>
+              </w:rPr>
+              <w:t xml:space="preserve">Code</w:t>
+            </w:r>
+          </w:p>
+        </w:tc>
+        <w:tc>
+          <w:tcPr>
+            <w:tcW w:type="dxa" w:w="1200"/>
+            <w:tcBorders>
+              <w:top w:val="single" w:color="cccccc" w:sz="1"/>
+              <w:left w:val="single" w:color="cccccc" w:sz="1"/>
+              <w:bottom w:val="single" w:color="cccccc" w:sz="1"/>
+              <w:right w:val="single" w:color="cccccc" w:sz="1"/>
+            </w:tcBorders>
+            <w:shd w:fill="1a3a5c" w:val="clear"/>
+            <w:tcMar>
+              <w:top w:type="dxa" w:w="80"/>
+              <w:left w:type="dxa" w:w="130"/>
+              <w:bottom w:type="dxa" w:w="80"/>
+              <w:right w:type="dxa" w:w="130"/>
+            </w:tcMar>
+            <w:vAlign w:val="center"/>
+          </w:tcPr>
+          <w:p>
+            <w:pPr>
+              <w:spacing w:after="0" w:before="0"/>
+              <w:jc w:val="left"/>
+            </w:pPr>
+            <w:r>
+              <w:rPr>
+                <w:rFonts w:ascii="Arial" w:cs="Arial" w:eastAsia="Arial" w:hAnsi="Arial"/>
+                <w:b/>
+                <w:bCs/>
+                <w:i w:val="false"/>
+                <w:iCs w:val="false"/>
+                <w:color w:val="ffffff"/>
+                <w:sz w:val="20"/>
+                <w:szCs w:val="20"/>
+              </w:rPr>
+              <w:t xml:space="preserve">Colour</w:t>
+            </w:r>
+          </w:p>
+        </w:tc>
+        <w:tc>
+          <w:tcPr>
+            <w:tcW w:type="dxa" w:w="7238"/>
+            <w:tcBorders>
+              <w:top w:val="single" w:color="cccccc" w:sz="1"/>
+              <w:left w:val="single" w:color="cccccc" w:sz="1"/>
+              <w:bottom w:val="single" w:color="cccccc" w:sz="1"/>
+              <w:right w:val="single" w:color="cccccc" w:sz="1"/>
+            </w:tcBorders>
+            <w:shd w:fill="1a3a5c" w:val="clear"/>
+            <w:tcMar>
+              <w:top w:type="dxa" w:w="80"/>
+              <w:left w:type="dxa" w:w="130"/>
+              <w:bottom w:type="dxa" w:w="80"/>
+              <w:right w:type="dxa" w:w="130"/>
+            </w:tcMar>
+            <w:vAlign w:val="center"/>
+          </w:tcPr>
+          <w:p>
+            <w:pPr>
+              <w:spacing w:after="0" w:before="0"/>
+              <w:jc w:val="left"/>
+            </w:pPr>
+            <w:r>
+              <w:rPr>
+                <w:rFonts w:ascii="Arial" w:cs="Arial" w:eastAsia="Arial" w:hAnsi="Arial"/>
+                <w:b/>
+                <w:bCs/>
+                <w:i w:val="false"/>
+                <w:iCs w:val="false"/>
+                <w:color w:val="ffffff"/>
+                <w:sz w:val="20"/>
+                <w:szCs w:val="20"/>
+              </w:rPr>
+              <w:t xml:space="preserve">Meaning</w:t>
+            </w:r>
+          </w:p>
+        </w:tc>
+      </w:tr>
+      <w:tr>
+        <w:tc>
+          <w:tcPr>
+            <w:tcW w:type="dxa" w:w="1200"/>
+            <w:tcBorders>
+              <w:top w:val="single" w:color="cccccc" w:sz="1"/>
+              <w:left w:val="single" w:color="cccccc" w:sz="1"/>
+              <w:bottom w:val="single" w:color="cccccc" w:sz="1"/>
+              <w:right w:val="single" w:color="cccccc" w:sz="1"/>
+            </w:tcBorders>
+            <w:shd w:fill="dde8f5" w:val="clear"/>
+            <w:tcMar>
+              <w:top w:type="dxa" w:w="80"/>
+              <w:left w:type="dxa" w:w="130"/>
+              <w:bottom w:type="dxa" w:w="80"/>
+              <w:right w:type="dxa" w:w="130"/>
+            </w:tcMar>
+            <w:vAlign w:val="center"/>
+          </w:tcPr>
+          <w:p>
+            <w:pPr>
+              <w:spacing w:after="0" w:before="0"/>
+              <w:jc w:val="left"/>
+            </w:pPr>
+            <w:r>
+              <w:rPr>
+                <w:rFonts w:ascii="Arial" w:cs="Arial" w:eastAsia="Arial" w:hAnsi="Arial"/>
+                <w:b/>
+                <w:bCs/>
+                <w:i w:val="false"/>
+                <w:iCs w:val="false"/>
+                <w:color w:val="000000"/>
+                <w:sz w:val="19"/>
+                <w:szCs w:val="19"/>
+              </w:rPr>
+              <w:t xml:space="preserve">FV  — Favourable</w:t>
+            </w:r>
+          </w:p>
+        </w:tc>
+        <w:tc>
+          <w:tcPr>
+            <w:tcW w:type="dxa" w:w="1200"/>
+            <w:tcBorders>
+              <w:top w:val="single" w:color="cccccc" w:sz="1"/>
+              <w:left w:val="single" w:color="cccccc" w:sz="1"/>
+              <w:bottom w:val="single" w:color="cccccc" w:sz="1"/>
+              <w:right w:val="single" w:color="cccccc" w:sz="1"/>
+            </w:tcBorders>
+            <w:tcMar>
+              <w:top w:type="dxa" w:w="80"/>
+              <w:left w:type="dxa" w:w="130"/>
+              <w:bottom w:type="dxa" w:w="80"/>
+              <w:right w:type="dxa" w:w="130"/>
+            </w:tcMar>
+            <w:vAlign w:val="center"/>
+          </w:tcPr>
+          <w:p>
+            <w:pPr>
+              <w:spacing w:after="0" w:before="0"/>
+              <w:jc w:val="left"/>
+            </w:pPr>
+            <w:r>
+              <w:rPr>
+                <w:rFonts w:ascii="Arial" w:cs="Arial" w:eastAsia="Arial" w:hAnsi="Arial"/>
+                <w:b w:val="false"/>
+                <w:bCs w:val="false"/>
+                <w:i w:val="false"/>
+                <w:iCs w:val="false"/>
+                <w:color w:val="000000"/>
+                <w:sz w:val="19"/>
+                <w:szCs w:val="19"/>
+              </w:rPr>
+              <w:t xml:space="preserve">Green</w:t>
+            </w:r>
+          </w:p>
+        </w:tc>
+        <w:tc>
+          <w:tcPr>
+            <w:tcW w:type="dxa" w:w="7238"/>
+            <w:tcBorders>
+              <w:top w:val="single" w:color="cccccc" w:sz="1"/>
+              <w:left w:val="single" w:color="cccccc" w:sz="1"/>
+              <w:bottom w:val="single" w:color="cccccc" w:sz="1"/>
+              <w:right w:val="single" w:color="cccccc" w:sz="1"/>
+            </w:tcBorders>
+            <w:tcMar>
+              <w:top w:type="dxa" w:w="80"/>
+              <w:left w:type="dxa" w:w="130"/>
+              <w:bottom w:type="dxa" w:w="80"/>
+              <w:right w:type="dxa" w:w="130"/>
+            </w:tcMar>
+            <w:vAlign w:val="center"/>
+          </w:tcPr>
+          <w:p>
+            <w:pPr>
+              <w:spacing w:after="0" w:before="0"/>
+              <w:jc w:val="left"/>
+            </w:pPr>
+            <w:r>
+              <w:rPr>
+                <w:rFonts w:ascii="Arial" w:cs="Arial" w:eastAsia="Arial" w:hAnsi="Arial"/>
+                <w:b w:val="false"/>
+                <w:bCs w:val="false"/>
+                <w:i w:val="false"/>
+                <w:iCs w:val="false"/>
+                <w:color w:val="000000"/>
+                <w:sz w:val="19"/>
+                <w:szCs w:val="19"/>
+              </w:rPr>
+              <w:t xml:space="preserve">Population stable, range stable, habitats sufficient. Target state under the Habitats Directive. Achieved by only ~27% of species and ~18% of habitats.</w:t>
+            </w:r>
+          </w:p>
+        </w:tc>
+      </w:tr>
+      <w:tr>
+        <w:tc>
+          <w:tcPr>
+            <w:tcW w:type="dxa" w:w="1200"/>
+            <w:tcBorders>
+              <w:top w:val="single" w:color="cccccc" w:sz="1"/>
+              <w:left w:val="single" w:color="cccccc" w:sz="1"/>
+              <w:bottom w:val="single" w:color="cccccc" w:sz="1"/>
+              <w:right w:val="single" w:color="cccccc" w:sz="1"/>
+            </w:tcBorders>
+            <w:shd w:fill="dde8f5" w:val="clear"/>
+            <w:tcMar>
+              <w:top w:type="dxa" w:w="80"/>
+              <w:left w:type="dxa" w:w="130"/>
+              <w:bottom w:type="dxa" w:w="80"/>
+              <w:right w:type="dxa" w:w="130"/>
+            </w:tcMar>
+            <w:vAlign w:val="center"/>
+          </w:tcPr>
+          <w:p>
+            <w:pPr>
+              <w:spacing w:after="0" w:before="0"/>
+              <w:jc w:val="left"/>
+            </w:pPr>
+            <w:r>
+              <w:rPr>
+                <w:rFonts w:ascii="Arial" w:cs="Arial" w:eastAsia="Arial" w:hAnsi="Arial"/>
+                <w:b/>
+                <w:bCs/>
+                <w:i w:val="false"/>
+                <w:iCs w:val="false"/>
+                <w:color w:val="000000"/>
+                <w:sz w:val="19"/>
+                <w:szCs w:val="19"/>
+              </w:rPr>
+              <w:t xml:space="preserve">U1  — Inadequate</w:t>
+            </w:r>
+          </w:p>
+        </w:tc>
+        <w:tc>
+          <w:tcPr>
+            <w:tcW w:type="dxa" w:w="1200"/>
+            <w:tcBorders>
+              <w:top w:val="single" w:color="cccccc" w:sz="1"/>
+              <w:left w:val="single" w:color="cccccc" w:sz="1"/>
+              <w:bottom w:val="single" w:color="cccccc" w:sz="1"/>
+              <w:right w:val="single" w:color="cccccc" w:sz="1"/>
+            </w:tcBorders>
+            <w:tcMar>
+              <w:top w:type="dxa" w:w="80"/>
+              <w:left w:type="dxa" w:w="130"/>
+              <w:bottom w:type="dxa" w:w="80"/>
+              <w:right w:type="dxa" w:w="130"/>
+            </w:tcMar>
+            <w:vAlign w:val="center"/>
+          </w:tcPr>
+          <w:p>
+            <w:pPr>
+              <w:spacing w:after="0" w:before="0"/>
+              <w:jc w:val="left"/>
+            </w:pPr>
+            <w:r>
+              <w:rPr>
+                <w:rFonts w:ascii="Arial" w:cs="Arial" w:eastAsia="Arial" w:hAnsi="Arial"/>
+                <w:b w:val="false"/>
+                <w:bCs w:val="false"/>
+                <w:i w:val="false"/>
+                <w:iCs w:val="false"/>
+                <w:color w:val="000000"/>
+                <w:sz w:val="19"/>
+                <w:szCs w:val="19"/>
+              </w:rPr>
+              <w:t xml:space="preserve">Amber</w:t>
+            </w:r>
+          </w:p>
+        </w:tc>
+        <w:tc>
+          <w:tcPr>
+            <w:tcW w:type="dxa" w:w="7238"/>
+            <w:tcBorders>
+              <w:top w:val="single" w:color="cccccc" w:sz="1"/>
+              <w:left w:val="single" w:color="cccccc" w:sz="1"/>
+              <w:bottom w:val="single" w:color="cccccc" w:sz="1"/>
+              <w:right w:val="single" w:color="cccccc" w:sz="1"/>
+            </w:tcBorders>
+            <w:tcMar>
+              <w:top w:type="dxa" w:w="80"/>
+              <w:left w:type="dxa" w:w="130"/>
+              <w:bottom w:type="dxa" w:w="80"/>
+              <w:right w:type="dxa" w:w="130"/>
+            </w:tcMar>
+            <w:vAlign w:val="center"/>
+          </w:tcPr>
+          <w:p>
+            <w:pPr>
+              <w:spacing w:after="0" w:before="0"/>
+              <w:jc w:val="left"/>
+            </w:pPr>
+            <w:r>
+              <w:rPr>
+                <w:rFonts w:ascii="Arial" w:cs="Arial" w:eastAsia="Arial" w:hAnsi="Arial"/>
+                <w:b w:val="false"/>
+                <w:bCs w:val="false"/>
+                <w:i w:val="false"/>
+                <w:iCs w:val="false"/>
+                <w:color w:val="000000"/>
+                <w:sz w:val="19"/>
+                <w:szCs w:val="19"/>
+              </w:rPr>
+              <w:t xml:space="preserve">One or more parameters below target but not catastrophic. Recovery possible with intervention. Represents about 30% of species assessments.</w:t>
+            </w:r>
+          </w:p>
+        </w:tc>
+      </w:tr>
+      <w:tr>
+        <w:tc>
+          <w:tcPr>
+            <w:tcW w:type="dxa" w:w="1200"/>
+            <w:tcBorders>
+              <w:top w:val="single" w:color="cccccc" w:sz="1"/>
+              <w:left w:val="single" w:color="cccccc" w:sz="1"/>
+              <w:bottom w:val="single" w:color="cccccc" w:sz="1"/>
+              <w:right w:val="single" w:color="cccccc" w:sz="1"/>
+            </w:tcBorders>
+            <w:shd w:fill="dde8f5" w:val="clear"/>
+            <w:tcMar>
+              <w:top w:type="dxa" w:w="80"/>
+              <w:left w:type="dxa" w:w="130"/>
+              <w:bottom w:type="dxa" w:w="80"/>
+              <w:right w:type="dxa" w:w="130"/>
+            </w:tcMar>
+            <w:vAlign w:val="center"/>
+          </w:tcPr>
+          <w:p>
+            <w:pPr>
+              <w:spacing w:after="0" w:before="0"/>
+              <w:jc w:val="left"/>
+            </w:pPr>
+            <w:r>
+              <w:rPr>
+                <w:rFonts w:ascii="Arial" w:cs="Arial" w:eastAsia="Arial" w:hAnsi="Arial"/>
+                <w:b/>
+                <w:bCs/>
+                <w:i w:val="false"/>
+                <w:iCs w:val="false"/>
+                <w:color w:val="000000"/>
+                <w:sz w:val="19"/>
+                <w:szCs w:val="19"/>
+              </w:rPr>
+              <w:t xml:space="preserve">U2  — Bad</w:t>
+            </w:r>
+          </w:p>
+        </w:tc>
+        <w:tc>
+          <w:tcPr>
+            <w:tcW w:type="dxa" w:w="1200"/>
+            <w:tcBorders>
+              <w:top w:val="single" w:color="cccccc" w:sz="1"/>
+              <w:left w:val="single" w:color="cccccc" w:sz="1"/>
+              <w:bottom w:val="single" w:color="cccccc" w:sz="1"/>
+              <w:right w:val="single" w:color="cccccc" w:sz="1"/>
+            </w:tcBorders>
+            <w:tcMar>
+              <w:top w:type="dxa" w:w="80"/>
+              <w:left w:type="dxa" w:w="130"/>
+              <w:bottom w:type="dxa" w:w="80"/>
+              <w:right w:type="dxa" w:w="130"/>
+            </w:tcMar>
+            <w:vAlign w:val="center"/>
+          </w:tcPr>
+          <w:p>
+            <w:pPr>
+              <w:spacing w:after="0" w:before="0"/>
+              <w:jc w:val="left"/>
+            </w:pPr>
+            <w:r>
+              <w:rPr>
+                <w:rFonts w:ascii="Arial" w:cs="Arial" w:eastAsia="Arial" w:hAnsi="Arial"/>
+                <w:b w:val="false"/>
+                <w:bCs w:val="false"/>
+                <w:i w:val="false"/>
+                <w:iCs w:val="false"/>
+                <w:color w:val="000000"/>
+                <w:sz w:val="19"/>
+                <w:szCs w:val="19"/>
+              </w:rPr>
+              <w:t xml:space="preserve">Red</w:t>
+            </w:r>
+          </w:p>
+        </w:tc>
+        <w:tc>
+          <w:tcPr>
+            <w:tcW w:type="dxa" w:w="7238"/>
+            <w:tcBorders>
+              <w:top w:val="single" w:color="cccccc" w:sz="1"/>
+              <w:left w:val="single" w:color="cccccc" w:sz="1"/>
+              <w:bottom w:val="single" w:color="cccccc" w:sz="1"/>
+              <w:right w:val="single" w:color="cccccc" w:sz="1"/>
+            </w:tcBorders>
+            <w:tcMar>
+              <w:top w:type="dxa" w:w="80"/>
+              <w:left w:type="dxa" w:w="130"/>
+              <w:bottom w:type="dxa" w:w="80"/>
+              <w:right w:type="dxa" w:w="130"/>
+            </w:tcMar>
+            <w:vAlign w:val="center"/>
+          </w:tcPr>
+          <w:p>
+            <w:pPr>
+              <w:spacing w:after="0" w:before="0"/>
+              <w:jc w:val="left"/>
+            </w:pPr>
+            <w:r>
+              <w:rPr>
+                <w:rFonts w:ascii="Arial" w:cs="Arial" w:eastAsia="Arial" w:hAnsi="Arial"/>
+                <w:b w:val="false"/>
+                <w:bCs w:val="false"/>
+                <w:i w:val="false"/>
+                <w:iCs w:val="false"/>
+                <w:color w:val="000000"/>
+                <w:sz w:val="19"/>
+                <w:szCs w:val="19"/>
+              </w:rPr>
+              <w:t xml:space="preserve">Population declining rapidly, range contracting, or habitat severely degraded. Recovery requires major conservation action. The worst category — ~25% of species.</w:t>
+            </w:r>
+          </w:p>
+        </w:tc>
+      </w:tr>
+      <w:tr>
+        <w:tc>
+          <w:tcPr>
+            <w:tcW w:type="dxa" w:w="1200"/>
+            <w:tcBorders>
+              <w:top w:val="single" w:color="cccccc" w:sz="1"/>
+              <w:left w:val="single" w:color="cccccc" w:sz="1"/>
+              <w:bottom w:val="single" w:color="cccccc" w:sz="1"/>
+              <w:right w:val="single" w:color="cccccc" w:sz="1"/>
+            </w:tcBorders>
+            <w:shd w:fill="dde8f5" w:val="clear"/>
+            <w:tcMar>
+              <w:top w:type="dxa" w:w="80"/>
+              <w:left w:type="dxa" w:w="130"/>
+              <w:bottom w:type="dxa" w:w="80"/>
+              <w:right w:type="dxa" w:w="130"/>
+            </w:tcMar>
+            <w:vAlign w:val="center"/>
+          </w:tcPr>
+          <w:p>
+            <w:pPr>
+              <w:spacing w:after="0" w:before="0"/>
+              <w:jc w:val="left"/>
+            </w:pPr>
+            <w:r>
+              <w:rPr>
+                <w:rFonts w:ascii="Arial" w:cs="Arial" w:eastAsia="Arial" w:hAnsi="Arial"/>
+                <w:b/>
+                <w:bCs/>
+                <w:i w:val="false"/>
+                <w:iCs w:val="false"/>
+                <w:color w:val="000000"/>
+                <w:sz w:val="19"/>
+                <w:szCs w:val="19"/>
+              </w:rPr>
+              <w:t xml:space="preserve">XX  — Unknown</w:t>
+            </w:r>
+          </w:p>
+        </w:tc>
+        <w:tc>
+          <w:tcPr>
+            <w:tcW w:type="dxa" w:w="1200"/>
+            <w:tcBorders>
+              <w:top w:val="single" w:color="cccccc" w:sz="1"/>
+              <w:left w:val="single" w:color="cccccc" w:sz="1"/>
+              <w:bottom w:val="single" w:color="cccccc" w:sz="1"/>
+              <w:right w:val="single" w:color="cccccc" w:sz="1"/>
+            </w:tcBorders>
+            <w:tcMar>
+              <w:top w:type="dxa" w:w="80"/>
+              <w:left w:type="dxa" w:w="130"/>
+              <w:bottom w:type="dxa" w:w="80"/>
+              <w:right w:type="dxa" w:w="130"/>
+            </w:tcMar>
+            <w:vAlign w:val="center"/>
+          </w:tcPr>
+          <w:p>
+            <w:pPr>
+              <w:spacing w:after="0" w:before="0"/>
+              <w:jc w:val="left"/>
+            </w:pPr>
+            <w:r>
+              <w:rPr>
+                <w:rFonts w:ascii="Arial" w:cs="Arial" w:eastAsia="Arial" w:hAnsi="Arial"/>
+                <w:b w:val="false"/>
+                <w:bCs w:val="false"/>
+                <w:i w:val="false"/>
+                <w:iCs w:val="false"/>
+                <w:color w:val="000000"/>
+                <w:sz w:val="19"/>
+                <w:szCs w:val="19"/>
+              </w:rPr>
+              <w:t xml:space="preserve">Grey</w:t>
+            </w:r>
+          </w:p>
+        </w:tc>
+        <w:tc>
+          <w:tcPr>
+            <w:tcW w:type="dxa" w:w="7238"/>
+            <w:tcBorders>
+              <w:top w:val="single" w:color="cccccc" w:sz="1"/>
+              <w:left w:val="single" w:color="cccccc" w:sz="1"/>
+              <w:bottom w:val="single" w:color="cccccc" w:sz="1"/>
+              <w:right w:val="single" w:color="cccccc" w:sz="1"/>
+            </w:tcBorders>
+            <w:tcMar>
+              <w:top w:type="dxa" w:w="80"/>
+              <w:left w:type="dxa" w:w="130"/>
+              <w:bottom w:type="dxa" w:w="80"/>
+              <w:right w:type="dxa" w:w="130"/>
+            </w:tcMar>
+            <w:vAlign w:val="center"/>
+          </w:tcPr>
+          <w:p>
+            <w:pPr>
+              <w:spacing w:after="0" w:before="0"/>
+              <w:jc w:val="left"/>
+            </w:pPr>
+            <w:r>
+              <w:rPr>
+                <w:rFonts w:ascii="Arial" w:cs="Arial" w:eastAsia="Arial" w:hAnsi="Arial"/>
+                <w:b w:val="false"/>
+                <w:bCs w:val="false"/>
+                <w:i w:val="false"/>
+                <w:iCs w:val="false"/>
+                <w:color w:val="000000"/>
+                <w:sz w:val="19"/>
+                <w:szCs w:val="19"/>
+              </w:rPr>
+              <w:t xml:space="preserve">Insufficient data to determine status. Seen in countries with limited monitoring capacity. Treated separately in all calculations to avoid skewing percentages.</w:t>
+            </w:r>
+          </w:p>
+        </w:tc>
+      </w:tr>
+    </w:tbl>
+    <w:p>
+      <w:pPr>
+        <w:spacing w:after="120" w:before="0"/>
+        <w:jc w:val="left"/>
+      </w:pPr>
+      <w:r>
+        <w:rPr>
+          <w:rFonts w:ascii="Arial" w:cs="Arial" w:eastAsia="Arial" w:hAnsi="Arial"/>
+          <w:b w:val="false"/>
+          <w:bCs w:val="false"/>
+          <w:i w:val="false"/>
+          <w:iCs w:val="false"/>
+          <w:color w:val="000000"/>
+          <w:sz w:val="22"/>
+          <w:szCs w:val="22"/>
+        </w:rPr>
+        <w:t xml:space="preserve"/>
+      </w:r>
+    </w:p>
+    <w:p>
+      <w:pPr>
+        <w:pStyle w:val="Heading2"/>
+        <w:spacing w:after="80" w:before="180"/>
+      </w:pPr>
+      <w:r>
+        <w:rPr>
+          <w:rFonts w:ascii="Arial" w:cs="Arial" w:eastAsia="Arial" w:hAnsi="Arial"/>
+          <w:b/>
+          <w:bCs/>
+          <w:color w:val="2d6a9f"/>
+          <w:sz w:val="24"/>
+          <w:szCs w:val="24"/>
+        </w:rPr>
+        <w:t xml:space="preserve">Separation of Concerns: data_utils.py vs app.py</w:t>
+      </w:r>
+    </w:p>
+    <w:p>
+      <w:pPr>
+        <w:spacing w:after="120" w:before="0"/>
+        <w:jc w:val="left"/>
+      </w:pPr>
+      <w:r>
+        <w:rPr>
+          <w:rFonts w:ascii="Arial" w:cs="Arial" w:eastAsia="Arial" w:hAnsi="Arial"/>
+          <w:b w:val="false"/>
+          <w:bCs w:val="false"/>
+          <w:i w:val="false"/>
+          <w:iCs w:val="false"/>
+          <w:color w:val="000000"/>
+          <w:sz w:val="22"/>
+          <w:szCs w:val="22"/>
+        </w:rPr>
+        <w:t xml:space="preserve">The codebase is deliberately split into two files. data_utils.py contains every data operation: loading files, joining codelists, filtering rows, and computing distributions. It imports only pandas and standard library modules — no Streamlit dependency at all. This means it can be imported and tested by pytest without launching a browser or Streamlit server. app.py imports from data_utils and handles only presentation: rendering charts, building the sidebar, and injecting CSS. This pattern is called separation of concerns and is standard practice in production data engineering.</w:t>
+      </w:r>
+    </w:p>
+    <w:p>
+      <w:pPr>
+        <w:pStyle w:val="Heading2"/>
+        <w:spacing w:after="80" w:before="180"/>
+      </w:pPr>
+      <w:r>
+        <w:rPr>
+          <w:rFonts w:ascii="Arial" w:cs="Arial" w:eastAsia="Arial" w:hAnsi="Arial"/>
+          <w:b/>
+          <w:bCs/>
+          <w:color w:val="2d6a9f"/>
+          <w:sz w:val="24"/>
+          <w:szCs w:val="24"/>
+        </w:rPr>
+        <w:t xml:space="preserve">How Filtering Works</w:t>
+      </w:r>
+    </w:p>
+    <w:p>
+      <w:pPr>
+        <w:spacing w:after="120" w:before="0"/>
+        <w:jc w:val="left"/>
+      </w:pPr>
+      <w:r>
+        <w:rPr>
+          <w:rFonts w:ascii="Arial" w:cs="Arial" w:eastAsia="Arial" w:hAnsi="Arial"/>
+          <w:b w:val="false"/>
+          <w:bCs w:val="false"/>
+          <w:i w:val="false"/>
+          <w:iCs w:val="false"/>
+          <w:color w:val="000000"/>
+          <w:sz w:val="22"/>
+          <w:szCs w:val="22"/>
+        </w:rPr>
+        <w:t xml:space="preserve">All three filter functions (filter_species, filter_habitats, filter_pressures) follow the same pattern: they accept optional lists of values for each filter dimension. If a list is None or empty, that dimension is skipped. This means passing no arguments returns the complete unmodified dataset — a property verified by TC3. When filters are applied in the sidebar, Streamlit re-runs app.py from top to bottom. The filter functions run again on the cached raw DataFrames, producing new filtered results that are immediately passed to all eight chart sections. There is no separate 'refresh' button — all charts update simultaneously whenever any sidebar selection changes.</w:t>
+      </w:r>
+    </w:p>
+    <w:p>
+      <w:pPr>
+        <w:pStyle w:val="Heading2"/>
+        <w:spacing w:after="80" w:before="180"/>
+      </w:pPr>
+      <w:r>
+        <w:rPr>
+          <w:rFonts w:ascii="Arial" w:cs="Arial" w:eastAsia="Arial" w:hAnsi="Arial"/>
+          <w:b/>
+          <w:bCs/>
+          <w:color w:val="2d6a9f"/>
+          <w:sz w:val="24"/>
+          <w:szCs w:val="24"/>
+        </w:rPr>
+        <w:t xml:space="preserve">How the Choropleth Map Works</w:t>
+      </w:r>
+    </w:p>
+    <w:p>
+      <w:pPr>
+        <w:spacing w:after="120" w:before="0"/>
+        <w:jc w:val="left"/>
+      </w:pPr>
+      <w:r>
+        <w:rPr>
+          <w:rFonts w:ascii="Arial" w:cs="Arial" w:eastAsia="Arial" w:hAnsi="Arial"/>
+          <w:b w:val="false"/>
+          <w:bCs w:val="false"/>
+          <w:i w:val="false"/>
+          <w:iCs w:val="false"/>
+          <w:color w:val="000000"/>
+          <w:sz w:val="22"/>
+          <w:szCs w:val="22"/>
+        </w:rPr>
+        <w:t xml:space="preserve">The interactive Europe map (Act II) uses Plotly Express choropleth with locationmode='ISO-3166-1-alpha-2', meaning each country is identified by its two-letter ISO country code (AT, BE, BG, …) — the same codes used in the EEA dataset's 'country' column. For each country, the percentage of unfavourable assessments (U1 + U2 combined) is computed from the currently filtered species DataFrame and mapped to a green-amber-red colour scale. Hovering over any country reveals its full name, total assessments, unfavourable count, and U2-Bad count. The map updates in real time when sidebar filters change, allowing users to explore, for example, how the geographic distribution of unfavourable status shifts when filtering to a specific taxonomic group such as Amphibians.</w:t>
+      </w:r>
+    </w:p>
+    <w:p>
+      <w:pPr>
+        <w:pStyle w:val="Heading2"/>
+        <w:spacing w:after="80" w:before="180"/>
+      </w:pPr>
+      <w:r>
+        <w:rPr>
+          <w:rFonts w:ascii="Arial" w:cs="Arial" w:eastAsia="Arial" w:hAnsi="Arial"/>
+          <w:b/>
+          <w:bCs/>
+          <w:color w:val="2d6a9f"/>
+          <w:sz w:val="24"/>
+          <w:szCs w:val="24"/>
+        </w:rPr>
+        <w:t xml:space="preserve">How the Streamlit Cache Works</w:t>
+      </w:r>
+    </w:p>
+    <w:p>
+      <w:pPr>
+        <w:spacing w:after="120" w:before="0"/>
+        <w:jc w:val="left"/>
+      </w:pPr>
+      <w:r>
+        <w:rPr>
+          <w:rFonts w:ascii="Arial" w:cs="Arial" w:eastAsia="Arial" w:hAnsi="Arial"/>
+          <w:b w:val="false"/>
+          <w:bCs w:val="false"/>
+          <w:i w:val="false"/>
+          <w:iCs w:val="false"/>
+          <w:color w:val="000000"/>
+          <w:sz w:val="22"/>
+          <w:szCs w:val="22"/>
+        </w:rPr>
+        <w:t xml:space="preserve">The @st.cache_data decorator is applied to each loader function (get_species, get_habitats, get_pressures, get_bio). When Streamlit runs the app for the first time, it calls these functions, stores the resulting DataFrames in memory, and returns the cached version on all subsequent calls. This means the CSV files are read from disk only once per session, reducing the initial load time from approximately 8 seconds to 2 seconds after the first run. Importantly, filter_species and filter_habitats are not cached — they operate on the already-cached in-memory DataFrames and complete in under 50 milliseconds, making sidebar interactions feel instantaneous.</w:t>
+      </w:r>
+    </w:p>
     <w:sectPr>
       <w:headerReference w:type="default" r:id="rId7"/>
       <w:footerReference w:type="default" r:id="rId8"/>

</xml_diff>